<commit_message>
chore: dev docker, templates, and build artifacts
- Switch docker-compose.dev.yml to Dockerfile.dev builds with bind mounts
- Add client/Dockerfile.dev and server/Dockerfile.dev
- Update Prisma migration lock file
- Update docx templates for employee card and consumables
</commit_message>
<xml_diff>
--- a/server/src/templates/consumables-template.docx
+++ b/server/src/templates/consumables-template.docx
@@ -69,7 +69,7 @@
       <w:tr>
         <w:tc>
           <w:tcPr>
-            <w:tcW w:type="pct" w:w="16%"/>
+            <w:tcW w:type="pct" w:w="14%"/>
           </w:tcPr>
           <w:p>
             <w:pPr>
@@ -89,7 +89,7 @@
         </w:tc>
         <w:tc>
           <w:tcPr>
-            <w:tcW w:type="pct" w:w="14%"/>
+            <w:tcW w:type="pct" w:w="12%"/>
           </w:tcPr>
           <w:p>
             <w:pPr>
@@ -109,7 +109,7 @@
         </w:tc>
         <w:tc>
           <w:tcPr>
-            <w:tcW w:type="pct" w:w="10%"/>
+            <w:tcW w:type="pct" w:w="12%"/>
           </w:tcPr>
           <w:p>
             <w:pPr>
@@ -129,7 +129,7 @@
         </w:tc>
         <w:tc>
           <w:tcPr>
-            <w:tcW w:type="pct" w:w="8%"/>
+            <w:tcW w:type="pct" w:w="6%"/>
           </w:tcPr>
           <w:p>
             <w:pPr>
@@ -209,7 +209,7 @@
         </w:tc>
         <w:tc>
           <w:tcPr>
-            <w:tcW w:type="pct" w:w="10%"/>
+            <w:tcW w:type="pct" w:w="8%"/>
           </w:tcPr>
           <w:p>
             <w:pPr>
@@ -249,7 +249,7 @@
         </w:tc>
         <w:tc>
           <w:tcPr>
-            <w:tcW w:type="pct" w:w="8%"/>
+            <w:tcW w:type="pct" w:w="6%"/>
           </w:tcPr>
           <w:p>
             <w:pPr>
@@ -271,7 +271,7 @@
       <w:tr>
         <w:tc>
           <w:tcPr>
-            <w:tcW w:type="pct" w:w="16%"/>
+            <w:tcW w:type="pct" w:w="14%"/>
           </w:tcPr>
           <w:p>
             <w:pPr>
@@ -289,7 +289,7 @@
         </w:tc>
         <w:tc>
           <w:tcPr>
-            <w:tcW w:type="pct" w:w="14%"/>
+            <w:tcW w:type="pct" w:w="12%"/>
           </w:tcPr>
           <w:p>
             <w:pPr>
@@ -307,6 +307,60 @@
         </w:tc>
         <w:tc>
           <w:tcPr>
+            <w:tcW w:type="pct" w:w="12%"/>
+          </w:tcPr>
+          <w:p>
+            <w:pPr>
+              <w:jc w:val="left"/>
+            </w:pPr>
+            <w:r>
+              <w:rPr>
+                <w:rFonts w:ascii="Times New Roman" w:cs="Times New Roman" w:eastAsia="Times New Roman" w:hAnsi="Times New Roman"/>
+                <w:sz w:val="22"/>
+                <w:szCs w:val="22"/>
+              </w:rPr>
+              <w:t xml:space="preserve">{item_0_date}</w:t>
+            </w:r>
+          </w:p>
+        </w:tc>
+        <w:tc>
+          <w:tcPr>
+            <w:tcW w:type="pct" w:w="6%"/>
+          </w:tcPr>
+          <w:p>
+            <w:pPr>
+              <w:jc w:val="left"/>
+            </w:pPr>
+            <w:r>
+              <w:rPr>
+                <w:rFonts w:ascii="Times New Roman" w:cs="Times New Roman" w:eastAsia="Times New Roman" w:hAnsi="Times New Roman"/>
+                <w:sz w:val="22"/>
+                <w:szCs w:val="22"/>
+              </w:rPr>
+              <w:t xml:space="preserve">{item_0_qty}</w:t>
+            </w:r>
+          </w:p>
+        </w:tc>
+        <w:tc>
+          <w:tcPr>
+            <w:tcW w:type="pct" w:w="8%"/>
+          </w:tcPr>
+          <w:p>
+            <w:pPr>
+              <w:jc w:val="left"/>
+            </w:pPr>
+            <w:r>
+              <w:rPr>
+                <w:rFonts w:ascii="Times New Roman" w:cs="Times New Roman" w:eastAsia="Times New Roman" w:hAnsi="Times New Roman"/>
+                <w:sz w:val="22"/>
+                <w:szCs w:val="22"/>
+              </w:rPr>
+              <w:t xml:space="preserve">лично</w:t>
+            </w:r>
+          </w:p>
+        </w:tc>
+        <w:tc>
+          <w:tcPr>
             <w:tcW w:type="pct" w:w="10%"/>
           </w:tcPr>
           <w:p>
@@ -319,43 +373,7 @@
                 <w:sz w:val="22"/>
                 <w:szCs w:val="22"/>
               </w:rPr>
-              <w:t xml:space="preserve">{item_0_date}</w:t>
-            </w:r>
-          </w:p>
-        </w:tc>
-        <w:tc>
-          <w:tcPr>
-            <w:tcW w:type="pct" w:w="8%"/>
-          </w:tcPr>
-          <w:p>
-            <w:pPr>
-              <w:jc w:val="left"/>
-            </w:pPr>
-            <w:r>
-              <w:rPr>
-                <w:rFonts w:ascii="Times New Roman" w:cs="Times New Roman" w:eastAsia="Times New Roman" w:hAnsi="Times New Roman"/>
-                <w:sz w:val="22"/>
-                <w:szCs w:val="22"/>
-              </w:rPr>
-              <w:t xml:space="preserve">{item_0_qty}</w:t>
-            </w:r>
-          </w:p>
-        </w:tc>
-        <w:tc>
-          <w:tcPr>
-            <w:tcW w:type="pct" w:w="8%"/>
-          </w:tcPr>
-          <w:p>
-            <w:pPr>
-              <w:jc w:val="left"/>
-            </w:pPr>
-            <w:r>
-              <w:rPr>
-                <w:rFonts w:ascii="Times New Roman" w:cs="Times New Roman" w:eastAsia="Times New Roman" w:hAnsi="Times New Roman"/>
-                <w:sz w:val="22"/>
-                <w:szCs w:val="22"/>
-              </w:rPr>
-              <w:t xml:space="preserve">лично</w:t>
+              <w:t xml:space="preserve">{item_0_sign}</w:t>
             </w:r>
           </w:p>
         </w:tc>
@@ -373,31 +391,13 @@
                 <w:sz w:val="22"/>
                 <w:szCs w:val="22"/>
               </w:rPr>
-              <w:t xml:space="preserve">{item_0_sign}</w:t>
-            </w:r>
-          </w:p>
-        </w:tc>
-        <w:tc>
-          <w:tcPr>
-            <w:tcW w:type="pct" w:w="10%"/>
-          </w:tcPr>
-          <w:p>
-            <w:pPr>
-              <w:jc w:val="left"/>
-            </w:pPr>
-            <w:r>
-              <w:rPr>
-                <w:rFonts w:ascii="Times New Roman" w:cs="Times New Roman" w:eastAsia="Times New Roman" w:hAnsi="Times New Roman"/>
-                <w:sz w:val="22"/>
-                <w:szCs w:val="22"/>
-              </w:rPr>
               <w:t xml:space="preserve">‒</w:t>
             </w:r>
           </w:p>
         </w:tc>
         <w:tc>
           <w:tcPr>
-            <w:tcW w:type="pct" w:w="10%"/>
+            <w:tcW w:type="pct" w:w="8%"/>
           </w:tcPr>
           <w:p>
             <w:pPr>
@@ -433,7 +433,7 @@
         </w:tc>
         <w:tc>
           <w:tcPr>
-            <w:tcW w:type="pct" w:w="8%"/>
+            <w:tcW w:type="pct" w:w="6%"/>
           </w:tcPr>
           <w:p>
             <w:pPr>
@@ -453,7 +453,7 @@
       <w:tr>
         <w:tc>
           <w:tcPr>
-            <w:tcW w:type="pct" w:w="16%"/>
+            <w:tcW w:type="pct" w:w="14%"/>
           </w:tcPr>
           <w:p>
             <w:pPr>
@@ -471,7 +471,7 @@
         </w:tc>
         <w:tc>
           <w:tcPr>
-            <w:tcW w:type="pct" w:w="14%"/>
+            <w:tcW w:type="pct" w:w="12%"/>
           </w:tcPr>
           <w:p>
             <w:pPr>
@@ -489,6 +489,60 @@
         </w:tc>
         <w:tc>
           <w:tcPr>
+            <w:tcW w:type="pct" w:w="12%"/>
+          </w:tcPr>
+          <w:p>
+            <w:pPr>
+              <w:jc w:val="left"/>
+            </w:pPr>
+            <w:r>
+              <w:rPr>
+                <w:rFonts w:ascii="Times New Roman" w:cs="Times New Roman" w:eastAsia="Times New Roman" w:hAnsi="Times New Roman"/>
+                <w:sz w:val="22"/>
+                <w:szCs w:val="22"/>
+              </w:rPr>
+              <w:t xml:space="preserve">{item_0_date}</w:t>
+            </w:r>
+          </w:p>
+        </w:tc>
+        <w:tc>
+          <w:tcPr>
+            <w:tcW w:type="pct" w:w="6%"/>
+          </w:tcPr>
+          <w:p>
+            <w:pPr>
+              <w:jc w:val="left"/>
+            </w:pPr>
+            <w:r>
+              <w:rPr>
+                <w:rFonts w:ascii="Times New Roman" w:cs="Times New Roman" w:eastAsia="Times New Roman" w:hAnsi="Times New Roman"/>
+                <w:sz w:val="22"/>
+                <w:szCs w:val="22"/>
+              </w:rPr>
+              <w:t xml:space="preserve">{item_0_qty}</w:t>
+            </w:r>
+          </w:p>
+        </w:tc>
+        <w:tc>
+          <w:tcPr>
+            <w:tcW w:type="pct" w:w="8%"/>
+          </w:tcPr>
+          <w:p>
+            <w:pPr>
+              <w:jc w:val="left"/>
+            </w:pPr>
+            <w:r>
+              <w:rPr>
+                <w:rFonts w:ascii="Times New Roman" w:cs="Times New Roman" w:eastAsia="Times New Roman" w:hAnsi="Times New Roman"/>
+                <w:sz w:val="22"/>
+                <w:szCs w:val="22"/>
+              </w:rPr>
+              <w:t xml:space="preserve">лично</w:t>
+            </w:r>
+          </w:p>
+        </w:tc>
+        <w:tc>
+          <w:tcPr>
             <w:tcW w:type="pct" w:w="10%"/>
           </w:tcPr>
           <w:p>
@@ -501,43 +555,7 @@
                 <w:sz w:val="22"/>
                 <w:szCs w:val="22"/>
               </w:rPr>
-              <w:t xml:space="preserve">{item_0_date}</w:t>
-            </w:r>
-          </w:p>
-        </w:tc>
-        <w:tc>
-          <w:tcPr>
-            <w:tcW w:type="pct" w:w="8%"/>
-          </w:tcPr>
-          <w:p>
-            <w:pPr>
-              <w:jc w:val="left"/>
-            </w:pPr>
-            <w:r>
-              <w:rPr>
-                <w:rFonts w:ascii="Times New Roman" w:cs="Times New Roman" w:eastAsia="Times New Roman" w:hAnsi="Times New Roman"/>
-                <w:sz w:val="22"/>
-                <w:szCs w:val="22"/>
-              </w:rPr>
-              <w:t xml:space="preserve">{item_0_qty}</w:t>
-            </w:r>
-          </w:p>
-        </w:tc>
-        <w:tc>
-          <w:tcPr>
-            <w:tcW w:type="pct" w:w="8%"/>
-          </w:tcPr>
-          <w:p>
-            <w:pPr>
-              <w:jc w:val="left"/>
-            </w:pPr>
-            <w:r>
-              <w:rPr>
-                <w:rFonts w:ascii="Times New Roman" w:cs="Times New Roman" w:eastAsia="Times New Roman" w:hAnsi="Times New Roman"/>
-                <w:sz w:val="22"/>
-                <w:szCs w:val="22"/>
-              </w:rPr>
-              <w:t xml:space="preserve">лично</w:t>
+              <w:t xml:space="preserve">{item_0_sign}</w:t>
             </w:r>
           </w:p>
         </w:tc>
@@ -555,31 +573,13 @@
                 <w:sz w:val="22"/>
                 <w:szCs w:val="22"/>
               </w:rPr>
-              <w:t xml:space="preserve">{item_0_sign}</w:t>
-            </w:r>
-          </w:p>
-        </w:tc>
-        <w:tc>
-          <w:tcPr>
-            <w:tcW w:type="pct" w:w="10%"/>
-          </w:tcPr>
-          <w:p>
-            <w:pPr>
-              <w:jc w:val="left"/>
-            </w:pPr>
-            <w:r>
-              <w:rPr>
-                <w:rFonts w:ascii="Times New Roman" w:cs="Times New Roman" w:eastAsia="Times New Roman" w:hAnsi="Times New Roman"/>
-                <w:sz w:val="22"/>
-                <w:szCs w:val="22"/>
-              </w:rPr>
               <w:t xml:space="preserve">‒</w:t>
             </w:r>
           </w:p>
         </w:tc>
         <w:tc>
           <w:tcPr>
-            <w:tcW w:type="pct" w:w="10%"/>
+            <w:tcW w:type="pct" w:w="8%"/>
           </w:tcPr>
           <w:p>
             <w:pPr>
@@ -615,7 +615,7 @@
         </w:tc>
         <w:tc>
           <w:tcPr>
-            <w:tcW w:type="pct" w:w="8%"/>
+            <w:tcW w:type="pct" w:w="6%"/>
           </w:tcPr>
           <w:p>
             <w:pPr>
@@ -635,7 +635,7 @@
       <w:tr>
         <w:tc>
           <w:tcPr>
-            <w:tcW w:type="pct" w:w="16%"/>
+            <w:tcW w:type="pct" w:w="14%"/>
           </w:tcPr>
           <w:p>
             <w:pPr>
@@ -653,7 +653,7 @@
         </w:tc>
         <w:tc>
           <w:tcPr>
-            <w:tcW w:type="pct" w:w="14%"/>
+            <w:tcW w:type="pct" w:w="12%"/>
           </w:tcPr>
           <w:p>
             <w:pPr>
@@ -671,6 +671,60 @@
         </w:tc>
         <w:tc>
           <w:tcPr>
+            <w:tcW w:type="pct" w:w="12%"/>
+          </w:tcPr>
+          <w:p>
+            <w:pPr>
+              <w:jc w:val="left"/>
+            </w:pPr>
+            <w:r>
+              <w:rPr>
+                <w:rFonts w:ascii="Times New Roman" w:cs="Times New Roman" w:eastAsia="Times New Roman" w:hAnsi="Times New Roman"/>
+                <w:sz w:val="22"/>
+                <w:szCs w:val="22"/>
+              </w:rPr>
+              <w:t xml:space="preserve">{item_0_date}</w:t>
+            </w:r>
+          </w:p>
+        </w:tc>
+        <w:tc>
+          <w:tcPr>
+            <w:tcW w:type="pct" w:w="6%"/>
+          </w:tcPr>
+          <w:p>
+            <w:pPr>
+              <w:jc w:val="left"/>
+            </w:pPr>
+            <w:r>
+              <w:rPr>
+                <w:rFonts w:ascii="Times New Roman" w:cs="Times New Roman" w:eastAsia="Times New Roman" w:hAnsi="Times New Roman"/>
+                <w:sz w:val="22"/>
+                <w:szCs w:val="22"/>
+              </w:rPr>
+              <w:t xml:space="preserve">{item_0_qty}</w:t>
+            </w:r>
+          </w:p>
+        </w:tc>
+        <w:tc>
+          <w:tcPr>
+            <w:tcW w:type="pct" w:w="8%"/>
+          </w:tcPr>
+          <w:p>
+            <w:pPr>
+              <w:jc w:val="left"/>
+            </w:pPr>
+            <w:r>
+              <w:rPr>
+                <w:rFonts w:ascii="Times New Roman" w:cs="Times New Roman" w:eastAsia="Times New Roman" w:hAnsi="Times New Roman"/>
+                <w:sz w:val="22"/>
+                <w:szCs w:val="22"/>
+              </w:rPr>
+              <w:t xml:space="preserve">лично</w:t>
+            </w:r>
+          </w:p>
+        </w:tc>
+        <w:tc>
+          <w:tcPr>
             <w:tcW w:type="pct" w:w="10%"/>
           </w:tcPr>
           <w:p>
@@ -683,43 +737,7 @@
                 <w:sz w:val="22"/>
                 <w:szCs w:val="22"/>
               </w:rPr>
-              <w:t xml:space="preserve">{item_0_date}</w:t>
-            </w:r>
-          </w:p>
-        </w:tc>
-        <w:tc>
-          <w:tcPr>
-            <w:tcW w:type="pct" w:w="8%"/>
-          </w:tcPr>
-          <w:p>
-            <w:pPr>
-              <w:jc w:val="left"/>
-            </w:pPr>
-            <w:r>
-              <w:rPr>
-                <w:rFonts w:ascii="Times New Roman" w:cs="Times New Roman" w:eastAsia="Times New Roman" w:hAnsi="Times New Roman"/>
-                <w:sz w:val="22"/>
-                <w:szCs w:val="22"/>
-              </w:rPr>
-              <w:t xml:space="preserve">{item_0_qty}</w:t>
-            </w:r>
-          </w:p>
-        </w:tc>
-        <w:tc>
-          <w:tcPr>
-            <w:tcW w:type="pct" w:w="8%"/>
-          </w:tcPr>
-          <w:p>
-            <w:pPr>
-              <w:jc w:val="left"/>
-            </w:pPr>
-            <w:r>
-              <w:rPr>
-                <w:rFonts w:ascii="Times New Roman" w:cs="Times New Roman" w:eastAsia="Times New Roman" w:hAnsi="Times New Roman"/>
-                <w:sz w:val="22"/>
-                <w:szCs w:val="22"/>
-              </w:rPr>
-              <w:t xml:space="preserve">лично</w:t>
+              <w:t xml:space="preserve">{item_0_sign}</w:t>
             </w:r>
           </w:p>
         </w:tc>
@@ -737,31 +755,13 @@
                 <w:sz w:val="22"/>
                 <w:szCs w:val="22"/>
               </w:rPr>
-              <w:t xml:space="preserve">{item_0_sign}</w:t>
-            </w:r>
-          </w:p>
-        </w:tc>
-        <w:tc>
-          <w:tcPr>
-            <w:tcW w:type="pct" w:w="10%"/>
-          </w:tcPr>
-          <w:p>
-            <w:pPr>
-              <w:jc w:val="left"/>
-            </w:pPr>
-            <w:r>
-              <w:rPr>
-                <w:rFonts w:ascii="Times New Roman" w:cs="Times New Roman" w:eastAsia="Times New Roman" w:hAnsi="Times New Roman"/>
-                <w:sz w:val="22"/>
-                <w:szCs w:val="22"/>
-              </w:rPr>
               <w:t xml:space="preserve">‒</w:t>
             </w:r>
           </w:p>
         </w:tc>
         <w:tc>
           <w:tcPr>
-            <w:tcW w:type="pct" w:w="10%"/>
+            <w:tcW w:type="pct" w:w="8%"/>
           </w:tcPr>
           <w:p>
             <w:pPr>
@@ -797,7 +797,7 @@
         </w:tc>
         <w:tc>
           <w:tcPr>
-            <w:tcW w:type="pct" w:w="8%"/>
+            <w:tcW w:type="pct" w:w="6%"/>
           </w:tcPr>
           <w:p>
             <w:pPr>
@@ -817,7 +817,7 @@
       <w:tr>
         <w:tc>
           <w:tcPr>
-            <w:tcW w:type="pct" w:w="16%"/>
+            <w:tcW w:type="pct" w:w="14%"/>
           </w:tcPr>
           <w:p>
             <w:pPr>
@@ -835,7 +835,7 @@
         </w:tc>
         <w:tc>
           <w:tcPr>
-            <w:tcW w:type="pct" w:w="14%"/>
+            <w:tcW w:type="pct" w:w="12%"/>
           </w:tcPr>
           <w:p>
             <w:pPr>
@@ -853,6 +853,60 @@
         </w:tc>
         <w:tc>
           <w:tcPr>
+            <w:tcW w:type="pct" w:w="12%"/>
+          </w:tcPr>
+          <w:p>
+            <w:pPr>
+              <w:jc w:val="left"/>
+            </w:pPr>
+            <w:r>
+              <w:rPr>
+                <w:rFonts w:ascii="Times New Roman" w:cs="Times New Roman" w:eastAsia="Times New Roman" w:hAnsi="Times New Roman"/>
+                <w:sz w:val="22"/>
+                <w:szCs w:val="22"/>
+              </w:rPr>
+              <w:t xml:space="preserve">{item_0_date}</w:t>
+            </w:r>
+          </w:p>
+        </w:tc>
+        <w:tc>
+          <w:tcPr>
+            <w:tcW w:type="pct" w:w="6%"/>
+          </w:tcPr>
+          <w:p>
+            <w:pPr>
+              <w:jc w:val="left"/>
+            </w:pPr>
+            <w:r>
+              <w:rPr>
+                <w:rFonts w:ascii="Times New Roman" w:cs="Times New Roman" w:eastAsia="Times New Roman" w:hAnsi="Times New Roman"/>
+                <w:sz w:val="22"/>
+                <w:szCs w:val="22"/>
+              </w:rPr>
+              <w:t xml:space="preserve">{item_0_qty}</w:t>
+            </w:r>
+          </w:p>
+        </w:tc>
+        <w:tc>
+          <w:tcPr>
+            <w:tcW w:type="pct" w:w="8%"/>
+          </w:tcPr>
+          <w:p>
+            <w:pPr>
+              <w:jc w:val="left"/>
+            </w:pPr>
+            <w:r>
+              <w:rPr>
+                <w:rFonts w:ascii="Times New Roman" w:cs="Times New Roman" w:eastAsia="Times New Roman" w:hAnsi="Times New Roman"/>
+                <w:sz w:val="22"/>
+                <w:szCs w:val="22"/>
+              </w:rPr>
+              <w:t xml:space="preserve">лично</w:t>
+            </w:r>
+          </w:p>
+        </w:tc>
+        <w:tc>
+          <w:tcPr>
             <w:tcW w:type="pct" w:w="10%"/>
           </w:tcPr>
           <w:p>
@@ -865,43 +919,7 @@
                 <w:sz w:val="22"/>
                 <w:szCs w:val="22"/>
               </w:rPr>
-              <w:t xml:space="preserve">{item_0_date}</w:t>
-            </w:r>
-          </w:p>
-        </w:tc>
-        <w:tc>
-          <w:tcPr>
-            <w:tcW w:type="pct" w:w="8%"/>
-          </w:tcPr>
-          <w:p>
-            <w:pPr>
-              <w:jc w:val="left"/>
-            </w:pPr>
-            <w:r>
-              <w:rPr>
-                <w:rFonts w:ascii="Times New Roman" w:cs="Times New Roman" w:eastAsia="Times New Roman" w:hAnsi="Times New Roman"/>
-                <w:sz w:val="22"/>
-                <w:szCs w:val="22"/>
-              </w:rPr>
-              <w:t xml:space="preserve">{item_0_qty}</w:t>
-            </w:r>
-          </w:p>
-        </w:tc>
-        <w:tc>
-          <w:tcPr>
-            <w:tcW w:type="pct" w:w="8%"/>
-          </w:tcPr>
-          <w:p>
-            <w:pPr>
-              <w:jc w:val="left"/>
-            </w:pPr>
-            <w:r>
-              <w:rPr>
-                <w:rFonts w:ascii="Times New Roman" w:cs="Times New Roman" w:eastAsia="Times New Roman" w:hAnsi="Times New Roman"/>
-                <w:sz w:val="22"/>
-                <w:szCs w:val="22"/>
-              </w:rPr>
-              <w:t xml:space="preserve">лично</w:t>
+              <w:t xml:space="preserve">{item_0_sign}</w:t>
             </w:r>
           </w:p>
         </w:tc>
@@ -919,31 +937,13 @@
                 <w:sz w:val="22"/>
                 <w:szCs w:val="22"/>
               </w:rPr>
-              <w:t xml:space="preserve">{item_0_sign}</w:t>
-            </w:r>
-          </w:p>
-        </w:tc>
-        <w:tc>
-          <w:tcPr>
-            <w:tcW w:type="pct" w:w="10%"/>
-          </w:tcPr>
-          <w:p>
-            <w:pPr>
-              <w:jc w:val="left"/>
-            </w:pPr>
-            <w:r>
-              <w:rPr>
-                <w:rFonts w:ascii="Times New Roman" w:cs="Times New Roman" w:eastAsia="Times New Roman" w:hAnsi="Times New Roman"/>
-                <w:sz w:val="22"/>
-                <w:szCs w:val="22"/>
-              </w:rPr>
               <w:t xml:space="preserve">‒</w:t>
             </w:r>
           </w:p>
         </w:tc>
         <w:tc>
           <w:tcPr>
-            <w:tcW w:type="pct" w:w="10%"/>
+            <w:tcW w:type="pct" w:w="8%"/>
           </w:tcPr>
           <w:p>
             <w:pPr>
@@ -979,7 +979,7 @@
         </w:tc>
         <w:tc>
           <w:tcPr>
-            <w:tcW w:type="pct" w:w="8%"/>
+            <w:tcW w:type="pct" w:w="6%"/>
           </w:tcPr>
           <w:p>
             <w:pPr>
@@ -1037,7 +1037,7 @@
       <w:tr>
         <w:tc>
           <w:tcPr>
-            <w:tcW w:type="pct" w:w="16%"/>
+            <w:tcW w:type="pct" w:w="14%"/>
           </w:tcPr>
           <w:p>
             <w:pPr>
@@ -1057,7 +1057,7 @@
         </w:tc>
         <w:tc>
           <w:tcPr>
-            <w:tcW w:type="pct" w:w="14%"/>
+            <w:tcW w:type="pct" w:w="12%"/>
           </w:tcPr>
           <w:p>
             <w:pPr>
@@ -1077,7 +1077,7 @@
         </w:tc>
         <w:tc>
           <w:tcPr>
-            <w:tcW w:type="pct" w:w="10%"/>
+            <w:tcW w:type="pct" w:w="12%"/>
           </w:tcPr>
           <w:p>
             <w:pPr>
@@ -1097,7 +1097,7 @@
         </w:tc>
         <w:tc>
           <w:tcPr>
-            <w:tcW w:type="pct" w:w="8%"/>
+            <w:tcW w:type="pct" w:w="6%"/>
           </w:tcPr>
           <w:p>
             <w:pPr>
@@ -1177,7 +1177,7 @@
         </w:tc>
         <w:tc>
           <w:tcPr>
-            <w:tcW w:type="pct" w:w="10%"/>
+            <w:tcW w:type="pct" w:w="8%"/>
           </w:tcPr>
           <w:p>
             <w:pPr>
@@ -1217,7 +1217,7 @@
         </w:tc>
         <w:tc>
           <w:tcPr>
-            <w:tcW w:type="pct" w:w="8%"/>
+            <w:tcW w:type="pct" w:w="6%"/>
           </w:tcPr>
           <w:p>
             <w:pPr>
@@ -1239,7 +1239,7 @@
       <w:tr>
         <w:tc>
           <w:tcPr>
-            <w:tcW w:type="pct" w:w="16%"/>
+            <w:tcW w:type="pct" w:w="14%"/>
           </w:tcPr>
           <w:p>
             <w:pPr>
@@ -1257,7 +1257,7 @@
         </w:tc>
         <w:tc>
           <w:tcPr>
-            <w:tcW w:type="pct" w:w="14%"/>
+            <w:tcW w:type="pct" w:w="12%"/>
           </w:tcPr>
           <w:p>
             <w:pPr>
@@ -1275,6 +1275,60 @@
         </w:tc>
         <w:tc>
           <w:tcPr>
+            <w:tcW w:type="pct" w:w="12%"/>
+          </w:tcPr>
+          <w:p>
+            <w:pPr>
+              <w:jc w:val="left"/>
+            </w:pPr>
+            <w:r>
+              <w:rPr>
+                <w:rFonts w:ascii="Times New Roman" w:cs="Times New Roman" w:eastAsia="Times New Roman" w:hAnsi="Times New Roman"/>
+                <w:sz w:val="22"/>
+                <w:szCs w:val="22"/>
+              </w:rPr>
+              <w:t xml:space="preserve">{item_1_date}</w:t>
+            </w:r>
+          </w:p>
+        </w:tc>
+        <w:tc>
+          <w:tcPr>
+            <w:tcW w:type="pct" w:w="6%"/>
+          </w:tcPr>
+          <w:p>
+            <w:pPr>
+              <w:jc w:val="left"/>
+            </w:pPr>
+            <w:r>
+              <w:rPr>
+                <w:rFonts w:ascii="Times New Roman" w:cs="Times New Roman" w:eastAsia="Times New Roman" w:hAnsi="Times New Roman"/>
+                <w:sz w:val="22"/>
+                <w:szCs w:val="22"/>
+              </w:rPr>
+              <w:t xml:space="preserve">{item_1_qty}</w:t>
+            </w:r>
+          </w:p>
+        </w:tc>
+        <w:tc>
+          <w:tcPr>
+            <w:tcW w:type="pct" w:w="8%"/>
+          </w:tcPr>
+          <w:p>
+            <w:pPr>
+              <w:jc w:val="left"/>
+            </w:pPr>
+            <w:r>
+              <w:rPr>
+                <w:rFonts w:ascii="Times New Roman" w:cs="Times New Roman" w:eastAsia="Times New Roman" w:hAnsi="Times New Roman"/>
+                <w:sz w:val="22"/>
+                <w:szCs w:val="22"/>
+              </w:rPr>
+              <w:t xml:space="preserve">лично</w:t>
+            </w:r>
+          </w:p>
+        </w:tc>
+        <w:tc>
+          <w:tcPr>
             <w:tcW w:type="pct" w:w="10%"/>
           </w:tcPr>
           <w:p>
@@ -1287,43 +1341,7 @@
                 <w:sz w:val="22"/>
                 <w:szCs w:val="22"/>
               </w:rPr>
-              <w:t xml:space="preserve">{item_1_date}</w:t>
-            </w:r>
-          </w:p>
-        </w:tc>
-        <w:tc>
-          <w:tcPr>
-            <w:tcW w:type="pct" w:w="8%"/>
-          </w:tcPr>
-          <w:p>
-            <w:pPr>
-              <w:jc w:val="left"/>
-            </w:pPr>
-            <w:r>
-              <w:rPr>
-                <w:rFonts w:ascii="Times New Roman" w:cs="Times New Roman" w:eastAsia="Times New Roman" w:hAnsi="Times New Roman"/>
-                <w:sz w:val="22"/>
-                <w:szCs w:val="22"/>
-              </w:rPr>
-              <w:t xml:space="preserve">{item_1_qty}</w:t>
-            </w:r>
-          </w:p>
-        </w:tc>
-        <w:tc>
-          <w:tcPr>
-            <w:tcW w:type="pct" w:w="8%"/>
-          </w:tcPr>
-          <w:p>
-            <w:pPr>
-              <w:jc w:val="left"/>
-            </w:pPr>
-            <w:r>
-              <w:rPr>
-                <w:rFonts w:ascii="Times New Roman" w:cs="Times New Roman" w:eastAsia="Times New Roman" w:hAnsi="Times New Roman"/>
-                <w:sz w:val="22"/>
-                <w:szCs w:val="22"/>
-              </w:rPr>
-              <w:t xml:space="preserve">лично</w:t>
+              <w:t xml:space="preserve">{item_1_sign}</w:t>
             </w:r>
           </w:p>
         </w:tc>
@@ -1341,31 +1359,13 @@
                 <w:sz w:val="22"/>
                 <w:szCs w:val="22"/>
               </w:rPr>
-              <w:t xml:space="preserve">{item_1_sign}</w:t>
-            </w:r>
-          </w:p>
-        </w:tc>
-        <w:tc>
-          <w:tcPr>
-            <w:tcW w:type="pct" w:w="10%"/>
-          </w:tcPr>
-          <w:p>
-            <w:pPr>
-              <w:jc w:val="left"/>
-            </w:pPr>
-            <w:r>
-              <w:rPr>
-                <w:rFonts w:ascii="Times New Roman" w:cs="Times New Roman" w:eastAsia="Times New Roman" w:hAnsi="Times New Roman"/>
-                <w:sz w:val="22"/>
-                <w:szCs w:val="22"/>
-              </w:rPr>
               <w:t xml:space="preserve">‒</w:t>
             </w:r>
           </w:p>
         </w:tc>
         <w:tc>
           <w:tcPr>
-            <w:tcW w:type="pct" w:w="10%"/>
+            <w:tcW w:type="pct" w:w="8%"/>
           </w:tcPr>
           <w:p>
             <w:pPr>
@@ -1401,7 +1401,7 @@
         </w:tc>
         <w:tc>
           <w:tcPr>
-            <w:tcW w:type="pct" w:w="8%"/>
+            <w:tcW w:type="pct" w:w="6%"/>
           </w:tcPr>
           <w:p>
             <w:pPr>
@@ -1421,7 +1421,7 @@
       <w:tr>
         <w:tc>
           <w:tcPr>
-            <w:tcW w:type="pct" w:w="16%"/>
+            <w:tcW w:type="pct" w:w="14%"/>
           </w:tcPr>
           <w:p>
             <w:pPr>
@@ -1439,7 +1439,7 @@
         </w:tc>
         <w:tc>
           <w:tcPr>
-            <w:tcW w:type="pct" w:w="14%"/>
+            <w:tcW w:type="pct" w:w="12%"/>
           </w:tcPr>
           <w:p>
             <w:pPr>
@@ -1457,6 +1457,60 @@
         </w:tc>
         <w:tc>
           <w:tcPr>
+            <w:tcW w:type="pct" w:w="12%"/>
+          </w:tcPr>
+          <w:p>
+            <w:pPr>
+              <w:jc w:val="left"/>
+            </w:pPr>
+            <w:r>
+              <w:rPr>
+                <w:rFonts w:ascii="Times New Roman" w:cs="Times New Roman" w:eastAsia="Times New Roman" w:hAnsi="Times New Roman"/>
+                <w:sz w:val="22"/>
+                <w:szCs w:val="22"/>
+              </w:rPr>
+              <w:t xml:space="preserve">{item_1_date}</w:t>
+            </w:r>
+          </w:p>
+        </w:tc>
+        <w:tc>
+          <w:tcPr>
+            <w:tcW w:type="pct" w:w="6%"/>
+          </w:tcPr>
+          <w:p>
+            <w:pPr>
+              <w:jc w:val="left"/>
+            </w:pPr>
+            <w:r>
+              <w:rPr>
+                <w:rFonts w:ascii="Times New Roman" w:cs="Times New Roman" w:eastAsia="Times New Roman" w:hAnsi="Times New Roman"/>
+                <w:sz w:val="22"/>
+                <w:szCs w:val="22"/>
+              </w:rPr>
+              <w:t xml:space="preserve">{item_1_qty}</w:t>
+            </w:r>
+          </w:p>
+        </w:tc>
+        <w:tc>
+          <w:tcPr>
+            <w:tcW w:type="pct" w:w="8%"/>
+          </w:tcPr>
+          <w:p>
+            <w:pPr>
+              <w:jc w:val="left"/>
+            </w:pPr>
+            <w:r>
+              <w:rPr>
+                <w:rFonts w:ascii="Times New Roman" w:cs="Times New Roman" w:eastAsia="Times New Roman" w:hAnsi="Times New Roman"/>
+                <w:sz w:val="22"/>
+                <w:szCs w:val="22"/>
+              </w:rPr>
+              <w:t xml:space="preserve">лично</w:t>
+            </w:r>
+          </w:p>
+        </w:tc>
+        <w:tc>
+          <w:tcPr>
             <w:tcW w:type="pct" w:w="10%"/>
           </w:tcPr>
           <w:p>
@@ -1469,43 +1523,7 @@
                 <w:sz w:val="22"/>
                 <w:szCs w:val="22"/>
               </w:rPr>
-              <w:t xml:space="preserve">{item_1_date}</w:t>
-            </w:r>
-          </w:p>
-        </w:tc>
-        <w:tc>
-          <w:tcPr>
-            <w:tcW w:type="pct" w:w="8%"/>
-          </w:tcPr>
-          <w:p>
-            <w:pPr>
-              <w:jc w:val="left"/>
-            </w:pPr>
-            <w:r>
-              <w:rPr>
-                <w:rFonts w:ascii="Times New Roman" w:cs="Times New Roman" w:eastAsia="Times New Roman" w:hAnsi="Times New Roman"/>
-                <w:sz w:val="22"/>
-                <w:szCs w:val="22"/>
-              </w:rPr>
-              <w:t xml:space="preserve">{item_1_qty}</w:t>
-            </w:r>
-          </w:p>
-        </w:tc>
-        <w:tc>
-          <w:tcPr>
-            <w:tcW w:type="pct" w:w="8%"/>
-          </w:tcPr>
-          <w:p>
-            <w:pPr>
-              <w:jc w:val="left"/>
-            </w:pPr>
-            <w:r>
-              <w:rPr>
-                <w:rFonts w:ascii="Times New Roman" w:cs="Times New Roman" w:eastAsia="Times New Roman" w:hAnsi="Times New Roman"/>
-                <w:sz w:val="22"/>
-                <w:szCs w:val="22"/>
-              </w:rPr>
-              <w:t xml:space="preserve">лично</w:t>
+              <w:t xml:space="preserve">{item_1_sign}</w:t>
             </w:r>
           </w:p>
         </w:tc>
@@ -1523,31 +1541,13 @@
                 <w:sz w:val="22"/>
                 <w:szCs w:val="22"/>
               </w:rPr>
-              <w:t xml:space="preserve">{item_1_sign}</w:t>
-            </w:r>
-          </w:p>
-        </w:tc>
-        <w:tc>
-          <w:tcPr>
-            <w:tcW w:type="pct" w:w="10%"/>
-          </w:tcPr>
-          <w:p>
-            <w:pPr>
-              <w:jc w:val="left"/>
-            </w:pPr>
-            <w:r>
-              <w:rPr>
-                <w:rFonts w:ascii="Times New Roman" w:cs="Times New Roman" w:eastAsia="Times New Roman" w:hAnsi="Times New Roman"/>
-                <w:sz w:val="22"/>
-                <w:szCs w:val="22"/>
-              </w:rPr>
               <w:t xml:space="preserve">‒</w:t>
             </w:r>
           </w:p>
         </w:tc>
         <w:tc>
           <w:tcPr>
-            <w:tcW w:type="pct" w:w="10%"/>
+            <w:tcW w:type="pct" w:w="8%"/>
           </w:tcPr>
           <w:p>
             <w:pPr>
@@ -1583,7 +1583,7 @@
         </w:tc>
         <w:tc>
           <w:tcPr>
-            <w:tcW w:type="pct" w:w="8%"/>
+            <w:tcW w:type="pct" w:w="6%"/>
           </w:tcPr>
           <w:p>
             <w:pPr>
@@ -1603,7 +1603,7 @@
       <w:tr>
         <w:tc>
           <w:tcPr>
-            <w:tcW w:type="pct" w:w="16%"/>
+            <w:tcW w:type="pct" w:w="14%"/>
           </w:tcPr>
           <w:p>
             <w:pPr>
@@ -1621,7 +1621,7 @@
         </w:tc>
         <w:tc>
           <w:tcPr>
-            <w:tcW w:type="pct" w:w="14%"/>
+            <w:tcW w:type="pct" w:w="12%"/>
           </w:tcPr>
           <w:p>
             <w:pPr>
@@ -1639,6 +1639,60 @@
         </w:tc>
         <w:tc>
           <w:tcPr>
+            <w:tcW w:type="pct" w:w="12%"/>
+          </w:tcPr>
+          <w:p>
+            <w:pPr>
+              <w:jc w:val="left"/>
+            </w:pPr>
+            <w:r>
+              <w:rPr>
+                <w:rFonts w:ascii="Times New Roman" w:cs="Times New Roman" w:eastAsia="Times New Roman" w:hAnsi="Times New Roman"/>
+                <w:sz w:val="22"/>
+                <w:szCs w:val="22"/>
+              </w:rPr>
+              <w:t xml:space="preserve">{item_1_date}</w:t>
+            </w:r>
+          </w:p>
+        </w:tc>
+        <w:tc>
+          <w:tcPr>
+            <w:tcW w:type="pct" w:w="6%"/>
+          </w:tcPr>
+          <w:p>
+            <w:pPr>
+              <w:jc w:val="left"/>
+            </w:pPr>
+            <w:r>
+              <w:rPr>
+                <w:rFonts w:ascii="Times New Roman" w:cs="Times New Roman" w:eastAsia="Times New Roman" w:hAnsi="Times New Roman"/>
+                <w:sz w:val="22"/>
+                <w:szCs w:val="22"/>
+              </w:rPr>
+              <w:t xml:space="preserve">{item_1_qty}</w:t>
+            </w:r>
+          </w:p>
+        </w:tc>
+        <w:tc>
+          <w:tcPr>
+            <w:tcW w:type="pct" w:w="8%"/>
+          </w:tcPr>
+          <w:p>
+            <w:pPr>
+              <w:jc w:val="left"/>
+            </w:pPr>
+            <w:r>
+              <w:rPr>
+                <w:rFonts w:ascii="Times New Roman" w:cs="Times New Roman" w:eastAsia="Times New Roman" w:hAnsi="Times New Roman"/>
+                <w:sz w:val="22"/>
+                <w:szCs w:val="22"/>
+              </w:rPr>
+              <w:t xml:space="preserve">лично</w:t>
+            </w:r>
+          </w:p>
+        </w:tc>
+        <w:tc>
+          <w:tcPr>
             <w:tcW w:type="pct" w:w="10%"/>
           </w:tcPr>
           <w:p>
@@ -1651,43 +1705,7 @@
                 <w:sz w:val="22"/>
                 <w:szCs w:val="22"/>
               </w:rPr>
-              <w:t xml:space="preserve">{item_1_date}</w:t>
-            </w:r>
-          </w:p>
-        </w:tc>
-        <w:tc>
-          <w:tcPr>
-            <w:tcW w:type="pct" w:w="8%"/>
-          </w:tcPr>
-          <w:p>
-            <w:pPr>
-              <w:jc w:val="left"/>
-            </w:pPr>
-            <w:r>
-              <w:rPr>
-                <w:rFonts w:ascii="Times New Roman" w:cs="Times New Roman" w:eastAsia="Times New Roman" w:hAnsi="Times New Roman"/>
-                <w:sz w:val="22"/>
-                <w:szCs w:val="22"/>
-              </w:rPr>
-              <w:t xml:space="preserve">{item_1_qty}</w:t>
-            </w:r>
-          </w:p>
-        </w:tc>
-        <w:tc>
-          <w:tcPr>
-            <w:tcW w:type="pct" w:w="8%"/>
-          </w:tcPr>
-          <w:p>
-            <w:pPr>
-              <w:jc w:val="left"/>
-            </w:pPr>
-            <w:r>
-              <w:rPr>
-                <w:rFonts w:ascii="Times New Roman" w:cs="Times New Roman" w:eastAsia="Times New Roman" w:hAnsi="Times New Roman"/>
-                <w:sz w:val="22"/>
-                <w:szCs w:val="22"/>
-              </w:rPr>
-              <w:t xml:space="preserve">лично</w:t>
+              <w:t xml:space="preserve">{item_1_sign}</w:t>
             </w:r>
           </w:p>
         </w:tc>
@@ -1705,31 +1723,13 @@
                 <w:sz w:val="22"/>
                 <w:szCs w:val="22"/>
               </w:rPr>
-              <w:t xml:space="preserve">{item_1_sign}</w:t>
-            </w:r>
-          </w:p>
-        </w:tc>
-        <w:tc>
-          <w:tcPr>
-            <w:tcW w:type="pct" w:w="10%"/>
-          </w:tcPr>
-          <w:p>
-            <w:pPr>
-              <w:jc w:val="left"/>
-            </w:pPr>
-            <w:r>
-              <w:rPr>
-                <w:rFonts w:ascii="Times New Roman" w:cs="Times New Roman" w:eastAsia="Times New Roman" w:hAnsi="Times New Roman"/>
-                <w:sz w:val="22"/>
-                <w:szCs w:val="22"/>
-              </w:rPr>
               <w:t xml:space="preserve">‒</w:t>
             </w:r>
           </w:p>
         </w:tc>
         <w:tc>
           <w:tcPr>
-            <w:tcW w:type="pct" w:w="10%"/>
+            <w:tcW w:type="pct" w:w="8%"/>
           </w:tcPr>
           <w:p>
             <w:pPr>
@@ -1765,7 +1765,7 @@
         </w:tc>
         <w:tc>
           <w:tcPr>
-            <w:tcW w:type="pct" w:w="8%"/>
+            <w:tcW w:type="pct" w:w="6%"/>
           </w:tcPr>
           <w:p>
             <w:pPr>
@@ -1785,7 +1785,7 @@
       <w:tr>
         <w:tc>
           <w:tcPr>
-            <w:tcW w:type="pct" w:w="16%"/>
+            <w:tcW w:type="pct" w:w="14%"/>
           </w:tcPr>
           <w:p>
             <w:pPr>
@@ -1803,7 +1803,7 @@
         </w:tc>
         <w:tc>
           <w:tcPr>
-            <w:tcW w:type="pct" w:w="14%"/>
+            <w:tcW w:type="pct" w:w="12%"/>
           </w:tcPr>
           <w:p>
             <w:pPr>
@@ -1821,6 +1821,60 @@
         </w:tc>
         <w:tc>
           <w:tcPr>
+            <w:tcW w:type="pct" w:w="12%"/>
+          </w:tcPr>
+          <w:p>
+            <w:pPr>
+              <w:jc w:val="left"/>
+            </w:pPr>
+            <w:r>
+              <w:rPr>
+                <w:rFonts w:ascii="Times New Roman" w:cs="Times New Roman" w:eastAsia="Times New Roman" w:hAnsi="Times New Roman"/>
+                <w:sz w:val="22"/>
+                <w:szCs w:val="22"/>
+              </w:rPr>
+              <w:t xml:space="preserve">{item_1_date}</w:t>
+            </w:r>
+          </w:p>
+        </w:tc>
+        <w:tc>
+          <w:tcPr>
+            <w:tcW w:type="pct" w:w="6%"/>
+          </w:tcPr>
+          <w:p>
+            <w:pPr>
+              <w:jc w:val="left"/>
+            </w:pPr>
+            <w:r>
+              <w:rPr>
+                <w:rFonts w:ascii="Times New Roman" w:cs="Times New Roman" w:eastAsia="Times New Roman" w:hAnsi="Times New Roman"/>
+                <w:sz w:val="22"/>
+                <w:szCs w:val="22"/>
+              </w:rPr>
+              <w:t xml:space="preserve">{item_1_qty}</w:t>
+            </w:r>
+          </w:p>
+        </w:tc>
+        <w:tc>
+          <w:tcPr>
+            <w:tcW w:type="pct" w:w="8%"/>
+          </w:tcPr>
+          <w:p>
+            <w:pPr>
+              <w:jc w:val="left"/>
+            </w:pPr>
+            <w:r>
+              <w:rPr>
+                <w:rFonts w:ascii="Times New Roman" w:cs="Times New Roman" w:eastAsia="Times New Roman" w:hAnsi="Times New Roman"/>
+                <w:sz w:val="22"/>
+                <w:szCs w:val="22"/>
+              </w:rPr>
+              <w:t xml:space="preserve">лично</w:t>
+            </w:r>
+          </w:p>
+        </w:tc>
+        <w:tc>
+          <w:tcPr>
             <w:tcW w:type="pct" w:w="10%"/>
           </w:tcPr>
           <w:p>
@@ -1833,43 +1887,7 @@
                 <w:sz w:val="22"/>
                 <w:szCs w:val="22"/>
               </w:rPr>
-              <w:t xml:space="preserve">{item_1_date}</w:t>
-            </w:r>
-          </w:p>
-        </w:tc>
-        <w:tc>
-          <w:tcPr>
-            <w:tcW w:type="pct" w:w="8%"/>
-          </w:tcPr>
-          <w:p>
-            <w:pPr>
-              <w:jc w:val="left"/>
-            </w:pPr>
-            <w:r>
-              <w:rPr>
-                <w:rFonts w:ascii="Times New Roman" w:cs="Times New Roman" w:eastAsia="Times New Roman" w:hAnsi="Times New Roman"/>
-                <w:sz w:val="22"/>
-                <w:szCs w:val="22"/>
-              </w:rPr>
-              <w:t xml:space="preserve">{item_1_qty}</w:t>
-            </w:r>
-          </w:p>
-        </w:tc>
-        <w:tc>
-          <w:tcPr>
-            <w:tcW w:type="pct" w:w="8%"/>
-          </w:tcPr>
-          <w:p>
-            <w:pPr>
-              <w:jc w:val="left"/>
-            </w:pPr>
-            <w:r>
-              <w:rPr>
-                <w:rFonts w:ascii="Times New Roman" w:cs="Times New Roman" w:eastAsia="Times New Roman" w:hAnsi="Times New Roman"/>
-                <w:sz w:val="22"/>
-                <w:szCs w:val="22"/>
-              </w:rPr>
-              <w:t xml:space="preserve">лично</w:t>
+              <w:t xml:space="preserve">{item_1_sign}</w:t>
             </w:r>
           </w:p>
         </w:tc>
@@ -1887,31 +1905,13 @@
                 <w:sz w:val="22"/>
                 <w:szCs w:val="22"/>
               </w:rPr>
-              <w:t xml:space="preserve">{item_1_sign}</w:t>
-            </w:r>
-          </w:p>
-        </w:tc>
-        <w:tc>
-          <w:tcPr>
-            <w:tcW w:type="pct" w:w="10%"/>
-          </w:tcPr>
-          <w:p>
-            <w:pPr>
-              <w:jc w:val="left"/>
-            </w:pPr>
-            <w:r>
-              <w:rPr>
-                <w:rFonts w:ascii="Times New Roman" w:cs="Times New Roman" w:eastAsia="Times New Roman" w:hAnsi="Times New Roman"/>
-                <w:sz w:val="22"/>
-                <w:szCs w:val="22"/>
-              </w:rPr>
               <w:t xml:space="preserve">‒</w:t>
             </w:r>
           </w:p>
         </w:tc>
         <w:tc>
           <w:tcPr>
-            <w:tcW w:type="pct" w:w="10%"/>
+            <w:tcW w:type="pct" w:w="8%"/>
           </w:tcPr>
           <w:p>
             <w:pPr>
@@ -1947,7 +1947,7 @@
         </w:tc>
         <w:tc>
           <w:tcPr>
-            <w:tcW w:type="pct" w:w="8%"/>
+            <w:tcW w:type="pct" w:w="6%"/>
           </w:tcPr>
           <w:p>
             <w:pPr>
@@ -2005,7 +2005,7 @@
       <w:tr>
         <w:tc>
           <w:tcPr>
-            <w:tcW w:type="pct" w:w="16%"/>
+            <w:tcW w:type="pct" w:w="14%"/>
           </w:tcPr>
           <w:p>
             <w:pPr>
@@ -2025,7 +2025,7 @@
         </w:tc>
         <w:tc>
           <w:tcPr>
-            <w:tcW w:type="pct" w:w="14%"/>
+            <w:tcW w:type="pct" w:w="12%"/>
           </w:tcPr>
           <w:p>
             <w:pPr>
@@ -2045,7 +2045,7 @@
         </w:tc>
         <w:tc>
           <w:tcPr>
-            <w:tcW w:type="pct" w:w="10%"/>
+            <w:tcW w:type="pct" w:w="12%"/>
           </w:tcPr>
           <w:p>
             <w:pPr>
@@ -2065,7 +2065,7 @@
         </w:tc>
         <w:tc>
           <w:tcPr>
-            <w:tcW w:type="pct" w:w="8%"/>
+            <w:tcW w:type="pct" w:w="6%"/>
           </w:tcPr>
           <w:p>
             <w:pPr>
@@ -2145,7 +2145,7 @@
         </w:tc>
         <w:tc>
           <w:tcPr>
-            <w:tcW w:type="pct" w:w="10%"/>
+            <w:tcW w:type="pct" w:w="8%"/>
           </w:tcPr>
           <w:p>
             <w:pPr>
@@ -2185,7 +2185,7 @@
         </w:tc>
         <w:tc>
           <w:tcPr>
-            <w:tcW w:type="pct" w:w="8%"/>
+            <w:tcW w:type="pct" w:w="6%"/>
           </w:tcPr>
           <w:p>
             <w:pPr>
@@ -2207,7 +2207,7 @@
       <w:tr>
         <w:tc>
           <w:tcPr>
-            <w:tcW w:type="pct" w:w="16%"/>
+            <w:tcW w:type="pct" w:w="14%"/>
           </w:tcPr>
           <w:p>
             <w:pPr>
@@ -2225,7 +2225,7 @@
         </w:tc>
         <w:tc>
           <w:tcPr>
-            <w:tcW w:type="pct" w:w="14%"/>
+            <w:tcW w:type="pct" w:w="12%"/>
           </w:tcPr>
           <w:p>
             <w:pPr>
@@ -2243,6 +2243,60 @@
         </w:tc>
         <w:tc>
           <w:tcPr>
+            <w:tcW w:type="pct" w:w="12%"/>
+          </w:tcPr>
+          <w:p>
+            <w:pPr>
+              <w:jc w:val="left"/>
+            </w:pPr>
+            <w:r>
+              <w:rPr>
+                <w:rFonts w:ascii="Times New Roman" w:cs="Times New Roman" w:eastAsia="Times New Roman" w:hAnsi="Times New Roman"/>
+                <w:sz w:val="22"/>
+                <w:szCs w:val="22"/>
+              </w:rPr>
+              <w:t xml:space="preserve">{item_2_date}</w:t>
+            </w:r>
+          </w:p>
+        </w:tc>
+        <w:tc>
+          <w:tcPr>
+            <w:tcW w:type="pct" w:w="6%"/>
+          </w:tcPr>
+          <w:p>
+            <w:pPr>
+              <w:jc w:val="left"/>
+            </w:pPr>
+            <w:r>
+              <w:rPr>
+                <w:rFonts w:ascii="Times New Roman" w:cs="Times New Roman" w:eastAsia="Times New Roman" w:hAnsi="Times New Roman"/>
+                <w:sz w:val="22"/>
+                <w:szCs w:val="22"/>
+              </w:rPr>
+              <w:t xml:space="preserve">{item_2_qty}</w:t>
+            </w:r>
+          </w:p>
+        </w:tc>
+        <w:tc>
+          <w:tcPr>
+            <w:tcW w:type="pct" w:w="8%"/>
+          </w:tcPr>
+          <w:p>
+            <w:pPr>
+              <w:jc w:val="left"/>
+            </w:pPr>
+            <w:r>
+              <w:rPr>
+                <w:rFonts w:ascii="Times New Roman" w:cs="Times New Roman" w:eastAsia="Times New Roman" w:hAnsi="Times New Roman"/>
+                <w:sz w:val="22"/>
+                <w:szCs w:val="22"/>
+              </w:rPr>
+              <w:t xml:space="preserve">лично</w:t>
+            </w:r>
+          </w:p>
+        </w:tc>
+        <w:tc>
+          <w:tcPr>
             <w:tcW w:type="pct" w:w="10%"/>
           </w:tcPr>
           <w:p>
@@ -2255,43 +2309,7 @@
                 <w:sz w:val="22"/>
                 <w:szCs w:val="22"/>
               </w:rPr>
-              <w:t xml:space="preserve">{item_2_date}</w:t>
-            </w:r>
-          </w:p>
-        </w:tc>
-        <w:tc>
-          <w:tcPr>
-            <w:tcW w:type="pct" w:w="8%"/>
-          </w:tcPr>
-          <w:p>
-            <w:pPr>
-              <w:jc w:val="left"/>
-            </w:pPr>
-            <w:r>
-              <w:rPr>
-                <w:rFonts w:ascii="Times New Roman" w:cs="Times New Roman" w:eastAsia="Times New Roman" w:hAnsi="Times New Roman"/>
-                <w:sz w:val="22"/>
-                <w:szCs w:val="22"/>
-              </w:rPr>
-              <w:t xml:space="preserve">{item_2_qty}</w:t>
-            </w:r>
-          </w:p>
-        </w:tc>
-        <w:tc>
-          <w:tcPr>
-            <w:tcW w:type="pct" w:w="8%"/>
-          </w:tcPr>
-          <w:p>
-            <w:pPr>
-              <w:jc w:val="left"/>
-            </w:pPr>
-            <w:r>
-              <w:rPr>
-                <w:rFonts w:ascii="Times New Roman" w:cs="Times New Roman" w:eastAsia="Times New Roman" w:hAnsi="Times New Roman"/>
-                <w:sz w:val="22"/>
-                <w:szCs w:val="22"/>
-              </w:rPr>
-              <w:t xml:space="preserve">лично</w:t>
+              <w:t xml:space="preserve">{item_2_sign}</w:t>
             </w:r>
           </w:p>
         </w:tc>
@@ -2309,31 +2327,13 @@
                 <w:sz w:val="22"/>
                 <w:szCs w:val="22"/>
               </w:rPr>
-              <w:t xml:space="preserve">{item_2_sign}</w:t>
-            </w:r>
-          </w:p>
-        </w:tc>
-        <w:tc>
-          <w:tcPr>
-            <w:tcW w:type="pct" w:w="10%"/>
-          </w:tcPr>
-          <w:p>
-            <w:pPr>
-              <w:jc w:val="left"/>
-            </w:pPr>
-            <w:r>
-              <w:rPr>
-                <w:rFonts w:ascii="Times New Roman" w:cs="Times New Roman" w:eastAsia="Times New Roman" w:hAnsi="Times New Roman"/>
-                <w:sz w:val="22"/>
-                <w:szCs w:val="22"/>
-              </w:rPr>
               <w:t xml:space="preserve">‒</w:t>
             </w:r>
           </w:p>
         </w:tc>
         <w:tc>
           <w:tcPr>
-            <w:tcW w:type="pct" w:w="10%"/>
+            <w:tcW w:type="pct" w:w="8%"/>
           </w:tcPr>
           <w:p>
             <w:pPr>
@@ -2369,7 +2369,7 @@
         </w:tc>
         <w:tc>
           <w:tcPr>
-            <w:tcW w:type="pct" w:w="8%"/>
+            <w:tcW w:type="pct" w:w="6%"/>
           </w:tcPr>
           <w:p>
             <w:pPr>
@@ -2389,7 +2389,7 @@
       <w:tr>
         <w:tc>
           <w:tcPr>
-            <w:tcW w:type="pct" w:w="16%"/>
+            <w:tcW w:type="pct" w:w="14%"/>
           </w:tcPr>
           <w:p>
             <w:pPr>
@@ -2407,7 +2407,7 @@
         </w:tc>
         <w:tc>
           <w:tcPr>
-            <w:tcW w:type="pct" w:w="14%"/>
+            <w:tcW w:type="pct" w:w="12%"/>
           </w:tcPr>
           <w:p>
             <w:pPr>
@@ -2425,6 +2425,60 @@
         </w:tc>
         <w:tc>
           <w:tcPr>
+            <w:tcW w:type="pct" w:w="12%"/>
+          </w:tcPr>
+          <w:p>
+            <w:pPr>
+              <w:jc w:val="left"/>
+            </w:pPr>
+            <w:r>
+              <w:rPr>
+                <w:rFonts w:ascii="Times New Roman" w:cs="Times New Roman" w:eastAsia="Times New Roman" w:hAnsi="Times New Roman"/>
+                <w:sz w:val="22"/>
+                <w:szCs w:val="22"/>
+              </w:rPr>
+              <w:t xml:space="preserve">{item_2_date}</w:t>
+            </w:r>
+          </w:p>
+        </w:tc>
+        <w:tc>
+          <w:tcPr>
+            <w:tcW w:type="pct" w:w="6%"/>
+          </w:tcPr>
+          <w:p>
+            <w:pPr>
+              <w:jc w:val="left"/>
+            </w:pPr>
+            <w:r>
+              <w:rPr>
+                <w:rFonts w:ascii="Times New Roman" w:cs="Times New Roman" w:eastAsia="Times New Roman" w:hAnsi="Times New Roman"/>
+                <w:sz w:val="22"/>
+                <w:szCs w:val="22"/>
+              </w:rPr>
+              <w:t xml:space="preserve">{item_2_qty}</w:t>
+            </w:r>
+          </w:p>
+        </w:tc>
+        <w:tc>
+          <w:tcPr>
+            <w:tcW w:type="pct" w:w="8%"/>
+          </w:tcPr>
+          <w:p>
+            <w:pPr>
+              <w:jc w:val="left"/>
+            </w:pPr>
+            <w:r>
+              <w:rPr>
+                <w:rFonts w:ascii="Times New Roman" w:cs="Times New Roman" w:eastAsia="Times New Roman" w:hAnsi="Times New Roman"/>
+                <w:sz w:val="22"/>
+                <w:szCs w:val="22"/>
+              </w:rPr>
+              <w:t xml:space="preserve">лично</w:t>
+            </w:r>
+          </w:p>
+        </w:tc>
+        <w:tc>
+          <w:tcPr>
             <w:tcW w:type="pct" w:w="10%"/>
           </w:tcPr>
           <w:p>
@@ -2437,43 +2491,7 @@
                 <w:sz w:val="22"/>
                 <w:szCs w:val="22"/>
               </w:rPr>
-              <w:t xml:space="preserve">{item_2_date}</w:t>
-            </w:r>
-          </w:p>
-        </w:tc>
-        <w:tc>
-          <w:tcPr>
-            <w:tcW w:type="pct" w:w="8%"/>
-          </w:tcPr>
-          <w:p>
-            <w:pPr>
-              <w:jc w:val="left"/>
-            </w:pPr>
-            <w:r>
-              <w:rPr>
-                <w:rFonts w:ascii="Times New Roman" w:cs="Times New Roman" w:eastAsia="Times New Roman" w:hAnsi="Times New Roman"/>
-                <w:sz w:val="22"/>
-                <w:szCs w:val="22"/>
-              </w:rPr>
-              <w:t xml:space="preserve">{item_2_qty}</w:t>
-            </w:r>
-          </w:p>
-        </w:tc>
-        <w:tc>
-          <w:tcPr>
-            <w:tcW w:type="pct" w:w="8%"/>
-          </w:tcPr>
-          <w:p>
-            <w:pPr>
-              <w:jc w:val="left"/>
-            </w:pPr>
-            <w:r>
-              <w:rPr>
-                <w:rFonts w:ascii="Times New Roman" w:cs="Times New Roman" w:eastAsia="Times New Roman" w:hAnsi="Times New Roman"/>
-                <w:sz w:val="22"/>
-                <w:szCs w:val="22"/>
-              </w:rPr>
-              <w:t xml:space="preserve">лично</w:t>
+              <w:t xml:space="preserve">{item_2_sign}</w:t>
             </w:r>
           </w:p>
         </w:tc>
@@ -2491,31 +2509,13 @@
                 <w:sz w:val="22"/>
                 <w:szCs w:val="22"/>
               </w:rPr>
-              <w:t xml:space="preserve">{item_2_sign}</w:t>
-            </w:r>
-          </w:p>
-        </w:tc>
-        <w:tc>
-          <w:tcPr>
-            <w:tcW w:type="pct" w:w="10%"/>
-          </w:tcPr>
-          <w:p>
-            <w:pPr>
-              <w:jc w:val="left"/>
-            </w:pPr>
-            <w:r>
-              <w:rPr>
-                <w:rFonts w:ascii="Times New Roman" w:cs="Times New Roman" w:eastAsia="Times New Roman" w:hAnsi="Times New Roman"/>
-                <w:sz w:val="22"/>
-                <w:szCs w:val="22"/>
-              </w:rPr>
               <w:t xml:space="preserve">‒</w:t>
             </w:r>
           </w:p>
         </w:tc>
         <w:tc>
           <w:tcPr>
-            <w:tcW w:type="pct" w:w="10%"/>
+            <w:tcW w:type="pct" w:w="8%"/>
           </w:tcPr>
           <w:p>
             <w:pPr>
@@ -2551,7 +2551,7 @@
         </w:tc>
         <w:tc>
           <w:tcPr>
-            <w:tcW w:type="pct" w:w="8%"/>
+            <w:tcW w:type="pct" w:w="6%"/>
           </w:tcPr>
           <w:p>
             <w:pPr>
@@ -2571,7 +2571,7 @@
       <w:tr>
         <w:tc>
           <w:tcPr>
-            <w:tcW w:type="pct" w:w="16%"/>
+            <w:tcW w:type="pct" w:w="14%"/>
           </w:tcPr>
           <w:p>
             <w:pPr>
@@ -2589,7 +2589,7 @@
         </w:tc>
         <w:tc>
           <w:tcPr>
-            <w:tcW w:type="pct" w:w="14%"/>
+            <w:tcW w:type="pct" w:w="12%"/>
           </w:tcPr>
           <w:p>
             <w:pPr>
@@ -2607,6 +2607,60 @@
         </w:tc>
         <w:tc>
           <w:tcPr>
+            <w:tcW w:type="pct" w:w="12%"/>
+          </w:tcPr>
+          <w:p>
+            <w:pPr>
+              <w:jc w:val="left"/>
+            </w:pPr>
+            <w:r>
+              <w:rPr>
+                <w:rFonts w:ascii="Times New Roman" w:cs="Times New Roman" w:eastAsia="Times New Roman" w:hAnsi="Times New Roman"/>
+                <w:sz w:val="22"/>
+                <w:szCs w:val="22"/>
+              </w:rPr>
+              <w:t xml:space="preserve">{item_2_date}</w:t>
+            </w:r>
+          </w:p>
+        </w:tc>
+        <w:tc>
+          <w:tcPr>
+            <w:tcW w:type="pct" w:w="6%"/>
+          </w:tcPr>
+          <w:p>
+            <w:pPr>
+              <w:jc w:val="left"/>
+            </w:pPr>
+            <w:r>
+              <w:rPr>
+                <w:rFonts w:ascii="Times New Roman" w:cs="Times New Roman" w:eastAsia="Times New Roman" w:hAnsi="Times New Roman"/>
+                <w:sz w:val="22"/>
+                <w:szCs w:val="22"/>
+              </w:rPr>
+              <w:t xml:space="preserve">{item_2_qty}</w:t>
+            </w:r>
+          </w:p>
+        </w:tc>
+        <w:tc>
+          <w:tcPr>
+            <w:tcW w:type="pct" w:w="8%"/>
+          </w:tcPr>
+          <w:p>
+            <w:pPr>
+              <w:jc w:val="left"/>
+            </w:pPr>
+            <w:r>
+              <w:rPr>
+                <w:rFonts w:ascii="Times New Roman" w:cs="Times New Roman" w:eastAsia="Times New Roman" w:hAnsi="Times New Roman"/>
+                <w:sz w:val="22"/>
+                <w:szCs w:val="22"/>
+              </w:rPr>
+              <w:t xml:space="preserve">лично</w:t>
+            </w:r>
+          </w:p>
+        </w:tc>
+        <w:tc>
+          <w:tcPr>
             <w:tcW w:type="pct" w:w="10%"/>
           </w:tcPr>
           <w:p>
@@ -2619,43 +2673,7 @@
                 <w:sz w:val="22"/>
                 <w:szCs w:val="22"/>
               </w:rPr>
-              <w:t xml:space="preserve">{item_2_date}</w:t>
-            </w:r>
-          </w:p>
-        </w:tc>
-        <w:tc>
-          <w:tcPr>
-            <w:tcW w:type="pct" w:w="8%"/>
-          </w:tcPr>
-          <w:p>
-            <w:pPr>
-              <w:jc w:val="left"/>
-            </w:pPr>
-            <w:r>
-              <w:rPr>
-                <w:rFonts w:ascii="Times New Roman" w:cs="Times New Roman" w:eastAsia="Times New Roman" w:hAnsi="Times New Roman"/>
-                <w:sz w:val="22"/>
-                <w:szCs w:val="22"/>
-              </w:rPr>
-              <w:t xml:space="preserve">{item_2_qty}</w:t>
-            </w:r>
-          </w:p>
-        </w:tc>
-        <w:tc>
-          <w:tcPr>
-            <w:tcW w:type="pct" w:w="8%"/>
-          </w:tcPr>
-          <w:p>
-            <w:pPr>
-              <w:jc w:val="left"/>
-            </w:pPr>
-            <w:r>
-              <w:rPr>
-                <w:rFonts w:ascii="Times New Roman" w:cs="Times New Roman" w:eastAsia="Times New Roman" w:hAnsi="Times New Roman"/>
-                <w:sz w:val="22"/>
-                <w:szCs w:val="22"/>
-              </w:rPr>
-              <w:t xml:space="preserve">лично</w:t>
+              <w:t xml:space="preserve">{item_2_sign}</w:t>
             </w:r>
           </w:p>
         </w:tc>
@@ -2673,31 +2691,13 @@
                 <w:sz w:val="22"/>
                 <w:szCs w:val="22"/>
               </w:rPr>
-              <w:t xml:space="preserve">{item_2_sign}</w:t>
-            </w:r>
-          </w:p>
-        </w:tc>
-        <w:tc>
-          <w:tcPr>
-            <w:tcW w:type="pct" w:w="10%"/>
-          </w:tcPr>
-          <w:p>
-            <w:pPr>
-              <w:jc w:val="left"/>
-            </w:pPr>
-            <w:r>
-              <w:rPr>
-                <w:rFonts w:ascii="Times New Roman" w:cs="Times New Roman" w:eastAsia="Times New Roman" w:hAnsi="Times New Roman"/>
-                <w:sz w:val="22"/>
-                <w:szCs w:val="22"/>
-              </w:rPr>
               <w:t xml:space="preserve">‒</w:t>
             </w:r>
           </w:p>
         </w:tc>
         <w:tc>
           <w:tcPr>
-            <w:tcW w:type="pct" w:w="10%"/>
+            <w:tcW w:type="pct" w:w="8%"/>
           </w:tcPr>
           <w:p>
             <w:pPr>
@@ -2733,7 +2733,7 @@
         </w:tc>
         <w:tc>
           <w:tcPr>
-            <w:tcW w:type="pct" w:w="8%"/>
+            <w:tcW w:type="pct" w:w="6%"/>
           </w:tcPr>
           <w:p>
             <w:pPr>
@@ -2753,7 +2753,7 @@
       <w:tr>
         <w:tc>
           <w:tcPr>
-            <w:tcW w:type="pct" w:w="16%"/>
+            <w:tcW w:type="pct" w:w="14%"/>
           </w:tcPr>
           <w:p>
             <w:pPr>
@@ -2771,7 +2771,7 @@
         </w:tc>
         <w:tc>
           <w:tcPr>
-            <w:tcW w:type="pct" w:w="14%"/>
+            <w:tcW w:type="pct" w:w="12%"/>
           </w:tcPr>
           <w:p>
             <w:pPr>
@@ -2789,6 +2789,60 @@
         </w:tc>
         <w:tc>
           <w:tcPr>
+            <w:tcW w:type="pct" w:w="12%"/>
+          </w:tcPr>
+          <w:p>
+            <w:pPr>
+              <w:jc w:val="left"/>
+            </w:pPr>
+            <w:r>
+              <w:rPr>
+                <w:rFonts w:ascii="Times New Roman" w:cs="Times New Roman" w:eastAsia="Times New Roman" w:hAnsi="Times New Roman"/>
+                <w:sz w:val="22"/>
+                <w:szCs w:val="22"/>
+              </w:rPr>
+              <w:t xml:space="preserve">{item_2_date}</w:t>
+            </w:r>
+          </w:p>
+        </w:tc>
+        <w:tc>
+          <w:tcPr>
+            <w:tcW w:type="pct" w:w="6%"/>
+          </w:tcPr>
+          <w:p>
+            <w:pPr>
+              <w:jc w:val="left"/>
+            </w:pPr>
+            <w:r>
+              <w:rPr>
+                <w:rFonts w:ascii="Times New Roman" w:cs="Times New Roman" w:eastAsia="Times New Roman" w:hAnsi="Times New Roman"/>
+                <w:sz w:val="22"/>
+                <w:szCs w:val="22"/>
+              </w:rPr>
+              <w:t xml:space="preserve">{item_2_qty}</w:t>
+            </w:r>
+          </w:p>
+        </w:tc>
+        <w:tc>
+          <w:tcPr>
+            <w:tcW w:type="pct" w:w="8%"/>
+          </w:tcPr>
+          <w:p>
+            <w:pPr>
+              <w:jc w:val="left"/>
+            </w:pPr>
+            <w:r>
+              <w:rPr>
+                <w:rFonts w:ascii="Times New Roman" w:cs="Times New Roman" w:eastAsia="Times New Roman" w:hAnsi="Times New Roman"/>
+                <w:sz w:val="22"/>
+                <w:szCs w:val="22"/>
+              </w:rPr>
+              <w:t xml:space="preserve">лично</w:t>
+            </w:r>
+          </w:p>
+        </w:tc>
+        <w:tc>
+          <w:tcPr>
             <w:tcW w:type="pct" w:w="10%"/>
           </w:tcPr>
           <w:p>
@@ -2801,43 +2855,7 @@
                 <w:sz w:val="22"/>
                 <w:szCs w:val="22"/>
               </w:rPr>
-              <w:t xml:space="preserve">{item_2_date}</w:t>
-            </w:r>
-          </w:p>
-        </w:tc>
-        <w:tc>
-          <w:tcPr>
-            <w:tcW w:type="pct" w:w="8%"/>
-          </w:tcPr>
-          <w:p>
-            <w:pPr>
-              <w:jc w:val="left"/>
-            </w:pPr>
-            <w:r>
-              <w:rPr>
-                <w:rFonts w:ascii="Times New Roman" w:cs="Times New Roman" w:eastAsia="Times New Roman" w:hAnsi="Times New Roman"/>
-                <w:sz w:val="22"/>
-                <w:szCs w:val="22"/>
-              </w:rPr>
-              <w:t xml:space="preserve">{item_2_qty}</w:t>
-            </w:r>
-          </w:p>
-        </w:tc>
-        <w:tc>
-          <w:tcPr>
-            <w:tcW w:type="pct" w:w="8%"/>
-          </w:tcPr>
-          <w:p>
-            <w:pPr>
-              <w:jc w:val="left"/>
-            </w:pPr>
-            <w:r>
-              <w:rPr>
-                <w:rFonts w:ascii="Times New Roman" w:cs="Times New Roman" w:eastAsia="Times New Roman" w:hAnsi="Times New Roman"/>
-                <w:sz w:val="22"/>
-                <w:szCs w:val="22"/>
-              </w:rPr>
-              <w:t xml:space="preserve">лично</w:t>
+              <w:t xml:space="preserve">{item_2_sign}</w:t>
             </w:r>
           </w:p>
         </w:tc>
@@ -2855,31 +2873,13 @@
                 <w:sz w:val="22"/>
                 <w:szCs w:val="22"/>
               </w:rPr>
-              <w:t xml:space="preserve">{item_2_sign}</w:t>
-            </w:r>
-          </w:p>
-        </w:tc>
-        <w:tc>
-          <w:tcPr>
-            <w:tcW w:type="pct" w:w="10%"/>
-          </w:tcPr>
-          <w:p>
-            <w:pPr>
-              <w:jc w:val="left"/>
-            </w:pPr>
-            <w:r>
-              <w:rPr>
-                <w:rFonts w:ascii="Times New Roman" w:cs="Times New Roman" w:eastAsia="Times New Roman" w:hAnsi="Times New Roman"/>
-                <w:sz w:val="22"/>
-                <w:szCs w:val="22"/>
-              </w:rPr>
               <w:t xml:space="preserve">‒</w:t>
             </w:r>
           </w:p>
         </w:tc>
         <w:tc>
           <w:tcPr>
-            <w:tcW w:type="pct" w:w="10%"/>
+            <w:tcW w:type="pct" w:w="8%"/>
           </w:tcPr>
           <w:p>
             <w:pPr>
@@ -2915,7 +2915,7 @@
         </w:tc>
         <w:tc>
           <w:tcPr>
-            <w:tcW w:type="pct" w:w="8%"/>
+            <w:tcW w:type="pct" w:w="6%"/>
           </w:tcPr>
           <w:p>
             <w:pPr>
@@ -2973,7 +2973,7 @@
       <w:tr>
         <w:tc>
           <w:tcPr>
-            <w:tcW w:type="pct" w:w="16%"/>
+            <w:tcW w:type="pct" w:w="14%"/>
           </w:tcPr>
           <w:p>
             <w:pPr>
@@ -2993,7 +2993,7 @@
         </w:tc>
         <w:tc>
           <w:tcPr>
-            <w:tcW w:type="pct" w:w="14%"/>
+            <w:tcW w:type="pct" w:w="12%"/>
           </w:tcPr>
           <w:p>
             <w:pPr>
@@ -3013,7 +3013,7 @@
         </w:tc>
         <w:tc>
           <w:tcPr>
-            <w:tcW w:type="pct" w:w="10%"/>
+            <w:tcW w:type="pct" w:w="12%"/>
           </w:tcPr>
           <w:p>
             <w:pPr>
@@ -3033,7 +3033,7 @@
         </w:tc>
         <w:tc>
           <w:tcPr>
-            <w:tcW w:type="pct" w:w="8%"/>
+            <w:tcW w:type="pct" w:w="6%"/>
           </w:tcPr>
           <w:p>
             <w:pPr>
@@ -3113,7 +3113,7 @@
         </w:tc>
         <w:tc>
           <w:tcPr>
-            <w:tcW w:type="pct" w:w="10%"/>
+            <w:tcW w:type="pct" w:w="8%"/>
           </w:tcPr>
           <w:p>
             <w:pPr>
@@ -3153,7 +3153,7 @@
         </w:tc>
         <w:tc>
           <w:tcPr>
-            <w:tcW w:type="pct" w:w="8%"/>
+            <w:tcW w:type="pct" w:w="6%"/>
           </w:tcPr>
           <w:p>
             <w:pPr>
@@ -3175,7 +3175,7 @@
       <w:tr>
         <w:tc>
           <w:tcPr>
-            <w:tcW w:type="pct" w:w="16%"/>
+            <w:tcW w:type="pct" w:w="14%"/>
           </w:tcPr>
           <w:p>
             <w:pPr>
@@ -3193,7 +3193,7 @@
         </w:tc>
         <w:tc>
           <w:tcPr>
-            <w:tcW w:type="pct" w:w="14%"/>
+            <w:tcW w:type="pct" w:w="12%"/>
           </w:tcPr>
           <w:p>
             <w:pPr>
@@ -3211,6 +3211,60 @@
         </w:tc>
         <w:tc>
           <w:tcPr>
+            <w:tcW w:type="pct" w:w="12%"/>
+          </w:tcPr>
+          <w:p>
+            <w:pPr>
+              <w:jc w:val="left"/>
+            </w:pPr>
+            <w:r>
+              <w:rPr>
+                <w:rFonts w:ascii="Times New Roman" w:cs="Times New Roman" w:eastAsia="Times New Roman" w:hAnsi="Times New Roman"/>
+                <w:sz w:val="22"/>
+                <w:szCs w:val="22"/>
+              </w:rPr>
+              <w:t xml:space="preserve">{item_3_date}</w:t>
+            </w:r>
+          </w:p>
+        </w:tc>
+        <w:tc>
+          <w:tcPr>
+            <w:tcW w:type="pct" w:w="6%"/>
+          </w:tcPr>
+          <w:p>
+            <w:pPr>
+              <w:jc w:val="left"/>
+            </w:pPr>
+            <w:r>
+              <w:rPr>
+                <w:rFonts w:ascii="Times New Roman" w:cs="Times New Roman" w:eastAsia="Times New Roman" w:hAnsi="Times New Roman"/>
+                <w:sz w:val="22"/>
+                <w:szCs w:val="22"/>
+              </w:rPr>
+              <w:t xml:space="preserve">{item_3_qty}</w:t>
+            </w:r>
+          </w:p>
+        </w:tc>
+        <w:tc>
+          <w:tcPr>
+            <w:tcW w:type="pct" w:w="8%"/>
+          </w:tcPr>
+          <w:p>
+            <w:pPr>
+              <w:jc w:val="left"/>
+            </w:pPr>
+            <w:r>
+              <w:rPr>
+                <w:rFonts w:ascii="Times New Roman" w:cs="Times New Roman" w:eastAsia="Times New Roman" w:hAnsi="Times New Roman"/>
+                <w:sz w:val="22"/>
+                <w:szCs w:val="22"/>
+              </w:rPr>
+              <w:t xml:space="preserve">лично</w:t>
+            </w:r>
+          </w:p>
+        </w:tc>
+        <w:tc>
+          <w:tcPr>
             <w:tcW w:type="pct" w:w="10%"/>
           </w:tcPr>
           <w:p>
@@ -3223,43 +3277,7 @@
                 <w:sz w:val="22"/>
                 <w:szCs w:val="22"/>
               </w:rPr>
-              <w:t xml:space="preserve">{item_3_date}</w:t>
-            </w:r>
-          </w:p>
-        </w:tc>
-        <w:tc>
-          <w:tcPr>
-            <w:tcW w:type="pct" w:w="8%"/>
-          </w:tcPr>
-          <w:p>
-            <w:pPr>
-              <w:jc w:val="left"/>
-            </w:pPr>
-            <w:r>
-              <w:rPr>
-                <w:rFonts w:ascii="Times New Roman" w:cs="Times New Roman" w:eastAsia="Times New Roman" w:hAnsi="Times New Roman"/>
-                <w:sz w:val="22"/>
-                <w:szCs w:val="22"/>
-              </w:rPr>
-              <w:t xml:space="preserve">{item_3_qty}</w:t>
-            </w:r>
-          </w:p>
-        </w:tc>
-        <w:tc>
-          <w:tcPr>
-            <w:tcW w:type="pct" w:w="8%"/>
-          </w:tcPr>
-          <w:p>
-            <w:pPr>
-              <w:jc w:val="left"/>
-            </w:pPr>
-            <w:r>
-              <w:rPr>
-                <w:rFonts w:ascii="Times New Roman" w:cs="Times New Roman" w:eastAsia="Times New Roman" w:hAnsi="Times New Roman"/>
-                <w:sz w:val="22"/>
-                <w:szCs w:val="22"/>
-              </w:rPr>
-              <w:t xml:space="preserve">лично</w:t>
+              <w:t xml:space="preserve">{item_3_sign}</w:t>
             </w:r>
           </w:p>
         </w:tc>
@@ -3277,31 +3295,13 @@
                 <w:sz w:val="22"/>
                 <w:szCs w:val="22"/>
               </w:rPr>
-              <w:t xml:space="preserve">{item_3_sign}</w:t>
-            </w:r>
-          </w:p>
-        </w:tc>
-        <w:tc>
-          <w:tcPr>
-            <w:tcW w:type="pct" w:w="10%"/>
-          </w:tcPr>
-          <w:p>
-            <w:pPr>
-              <w:jc w:val="left"/>
-            </w:pPr>
-            <w:r>
-              <w:rPr>
-                <w:rFonts w:ascii="Times New Roman" w:cs="Times New Roman" w:eastAsia="Times New Roman" w:hAnsi="Times New Roman"/>
-                <w:sz w:val="22"/>
-                <w:szCs w:val="22"/>
-              </w:rPr>
               <w:t xml:space="preserve">‒</w:t>
             </w:r>
           </w:p>
         </w:tc>
         <w:tc>
           <w:tcPr>
-            <w:tcW w:type="pct" w:w="10%"/>
+            <w:tcW w:type="pct" w:w="8%"/>
           </w:tcPr>
           <w:p>
             <w:pPr>
@@ -3337,7 +3337,7 @@
         </w:tc>
         <w:tc>
           <w:tcPr>
-            <w:tcW w:type="pct" w:w="8%"/>
+            <w:tcW w:type="pct" w:w="6%"/>
           </w:tcPr>
           <w:p>
             <w:pPr>
@@ -3357,7 +3357,7 @@
       <w:tr>
         <w:tc>
           <w:tcPr>
-            <w:tcW w:type="pct" w:w="16%"/>
+            <w:tcW w:type="pct" w:w="14%"/>
           </w:tcPr>
           <w:p>
             <w:pPr>
@@ -3375,7 +3375,7 @@
         </w:tc>
         <w:tc>
           <w:tcPr>
-            <w:tcW w:type="pct" w:w="14%"/>
+            <w:tcW w:type="pct" w:w="12%"/>
           </w:tcPr>
           <w:p>
             <w:pPr>
@@ -3393,6 +3393,60 @@
         </w:tc>
         <w:tc>
           <w:tcPr>
+            <w:tcW w:type="pct" w:w="12%"/>
+          </w:tcPr>
+          <w:p>
+            <w:pPr>
+              <w:jc w:val="left"/>
+            </w:pPr>
+            <w:r>
+              <w:rPr>
+                <w:rFonts w:ascii="Times New Roman" w:cs="Times New Roman" w:eastAsia="Times New Roman" w:hAnsi="Times New Roman"/>
+                <w:sz w:val="22"/>
+                <w:szCs w:val="22"/>
+              </w:rPr>
+              <w:t xml:space="preserve">{item_3_date}</w:t>
+            </w:r>
+          </w:p>
+        </w:tc>
+        <w:tc>
+          <w:tcPr>
+            <w:tcW w:type="pct" w:w="6%"/>
+          </w:tcPr>
+          <w:p>
+            <w:pPr>
+              <w:jc w:val="left"/>
+            </w:pPr>
+            <w:r>
+              <w:rPr>
+                <w:rFonts w:ascii="Times New Roman" w:cs="Times New Roman" w:eastAsia="Times New Roman" w:hAnsi="Times New Roman"/>
+                <w:sz w:val="22"/>
+                <w:szCs w:val="22"/>
+              </w:rPr>
+              <w:t xml:space="preserve">{item_3_qty}</w:t>
+            </w:r>
+          </w:p>
+        </w:tc>
+        <w:tc>
+          <w:tcPr>
+            <w:tcW w:type="pct" w:w="8%"/>
+          </w:tcPr>
+          <w:p>
+            <w:pPr>
+              <w:jc w:val="left"/>
+            </w:pPr>
+            <w:r>
+              <w:rPr>
+                <w:rFonts w:ascii="Times New Roman" w:cs="Times New Roman" w:eastAsia="Times New Roman" w:hAnsi="Times New Roman"/>
+                <w:sz w:val="22"/>
+                <w:szCs w:val="22"/>
+              </w:rPr>
+              <w:t xml:space="preserve">лично</w:t>
+            </w:r>
+          </w:p>
+        </w:tc>
+        <w:tc>
+          <w:tcPr>
             <w:tcW w:type="pct" w:w="10%"/>
           </w:tcPr>
           <w:p>
@@ -3405,43 +3459,7 @@
                 <w:sz w:val="22"/>
                 <w:szCs w:val="22"/>
               </w:rPr>
-              <w:t xml:space="preserve">{item_3_date}</w:t>
-            </w:r>
-          </w:p>
-        </w:tc>
-        <w:tc>
-          <w:tcPr>
-            <w:tcW w:type="pct" w:w="8%"/>
-          </w:tcPr>
-          <w:p>
-            <w:pPr>
-              <w:jc w:val="left"/>
-            </w:pPr>
-            <w:r>
-              <w:rPr>
-                <w:rFonts w:ascii="Times New Roman" w:cs="Times New Roman" w:eastAsia="Times New Roman" w:hAnsi="Times New Roman"/>
-                <w:sz w:val="22"/>
-                <w:szCs w:val="22"/>
-              </w:rPr>
-              <w:t xml:space="preserve">{item_3_qty}</w:t>
-            </w:r>
-          </w:p>
-        </w:tc>
-        <w:tc>
-          <w:tcPr>
-            <w:tcW w:type="pct" w:w="8%"/>
-          </w:tcPr>
-          <w:p>
-            <w:pPr>
-              <w:jc w:val="left"/>
-            </w:pPr>
-            <w:r>
-              <w:rPr>
-                <w:rFonts w:ascii="Times New Roman" w:cs="Times New Roman" w:eastAsia="Times New Roman" w:hAnsi="Times New Roman"/>
-                <w:sz w:val="22"/>
-                <w:szCs w:val="22"/>
-              </w:rPr>
-              <w:t xml:space="preserve">лично</w:t>
+              <w:t xml:space="preserve">{item_3_sign}</w:t>
             </w:r>
           </w:p>
         </w:tc>
@@ -3459,31 +3477,13 @@
                 <w:sz w:val="22"/>
                 <w:szCs w:val="22"/>
               </w:rPr>
-              <w:t xml:space="preserve">{item_3_sign}</w:t>
-            </w:r>
-          </w:p>
-        </w:tc>
-        <w:tc>
-          <w:tcPr>
-            <w:tcW w:type="pct" w:w="10%"/>
-          </w:tcPr>
-          <w:p>
-            <w:pPr>
-              <w:jc w:val="left"/>
-            </w:pPr>
-            <w:r>
-              <w:rPr>
-                <w:rFonts w:ascii="Times New Roman" w:cs="Times New Roman" w:eastAsia="Times New Roman" w:hAnsi="Times New Roman"/>
-                <w:sz w:val="22"/>
-                <w:szCs w:val="22"/>
-              </w:rPr>
               <w:t xml:space="preserve">‒</w:t>
             </w:r>
           </w:p>
         </w:tc>
         <w:tc>
           <w:tcPr>
-            <w:tcW w:type="pct" w:w="10%"/>
+            <w:tcW w:type="pct" w:w="8%"/>
           </w:tcPr>
           <w:p>
             <w:pPr>
@@ -3519,7 +3519,7 @@
         </w:tc>
         <w:tc>
           <w:tcPr>
-            <w:tcW w:type="pct" w:w="8%"/>
+            <w:tcW w:type="pct" w:w="6%"/>
           </w:tcPr>
           <w:p>
             <w:pPr>
@@ -3539,7 +3539,7 @@
       <w:tr>
         <w:tc>
           <w:tcPr>
-            <w:tcW w:type="pct" w:w="16%"/>
+            <w:tcW w:type="pct" w:w="14%"/>
           </w:tcPr>
           <w:p>
             <w:pPr>
@@ -3557,7 +3557,7 @@
         </w:tc>
         <w:tc>
           <w:tcPr>
-            <w:tcW w:type="pct" w:w="14%"/>
+            <w:tcW w:type="pct" w:w="12%"/>
           </w:tcPr>
           <w:p>
             <w:pPr>
@@ -3575,6 +3575,60 @@
         </w:tc>
         <w:tc>
           <w:tcPr>
+            <w:tcW w:type="pct" w:w="12%"/>
+          </w:tcPr>
+          <w:p>
+            <w:pPr>
+              <w:jc w:val="left"/>
+            </w:pPr>
+            <w:r>
+              <w:rPr>
+                <w:rFonts w:ascii="Times New Roman" w:cs="Times New Roman" w:eastAsia="Times New Roman" w:hAnsi="Times New Roman"/>
+                <w:sz w:val="22"/>
+                <w:szCs w:val="22"/>
+              </w:rPr>
+              <w:t xml:space="preserve">{item_3_date}</w:t>
+            </w:r>
+          </w:p>
+        </w:tc>
+        <w:tc>
+          <w:tcPr>
+            <w:tcW w:type="pct" w:w="6%"/>
+          </w:tcPr>
+          <w:p>
+            <w:pPr>
+              <w:jc w:val="left"/>
+            </w:pPr>
+            <w:r>
+              <w:rPr>
+                <w:rFonts w:ascii="Times New Roman" w:cs="Times New Roman" w:eastAsia="Times New Roman" w:hAnsi="Times New Roman"/>
+                <w:sz w:val="22"/>
+                <w:szCs w:val="22"/>
+              </w:rPr>
+              <w:t xml:space="preserve">{item_3_qty}</w:t>
+            </w:r>
+          </w:p>
+        </w:tc>
+        <w:tc>
+          <w:tcPr>
+            <w:tcW w:type="pct" w:w="8%"/>
+          </w:tcPr>
+          <w:p>
+            <w:pPr>
+              <w:jc w:val="left"/>
+            </w:pPr>
+            <w:r>
+              <w:rPr>
+                <w:rFonts w:ascii="Times New Roman" w:cs="Times New Roman" w:eastAsia="Times New Roman" w:hAnsi="Times New Roman"/>
+                <w:sz w:val="22"/>
+                <w:szCs w:val="22"/>
+              </w:rPr>
+              <w:t xml:space="preserve">лично</w:t>
+            </w:r>
+          </w:p>
+        </w:tc>
+        <w:tc>
+          <w:tcPr>
             <w:tcW w:type="pct" w:w="10%"/>
           </w:tcPr>
           <w:p>
@@ -3587,43 +3641,7 @@
                 <w:sz w:val="22"/>
                 <w:szCs w:val="22"/>
               </w:rPr>
-              <w:t xml:space="preserve">{item_3_date}</w:t>
-            </w:r>
-          </w:p>
-        </w:tc>
-        <w:tc>
-          <w:tcPr>
-            <w:tcW w:type="pct" w:w="8%"/>
-          </w:tcPr>
-          <w:p>
-            <w:pPr>
-              <w:jc w:val="left"/>
-            </w:pPr>
-            <w:r>
-              <w:rPr>
-                <w:rFonts w:ascii="Times New Roman" w:cs="Times New Roman" w:eastAsia="Times New Roman" w:hAnsi="Times New Roman"/>
-                <w:sz w:val="22"/>
-                <w:szCs w:val="22"/>
-              </w:rPr>
-              <w:t xml:space="preserve">{item_3_qty}</w:t>
-            </w:r>
-          </w:p>
-        </w:tc>
-        <w:tc>
-          <w:tcPr>
-            <w:tcW w:type="pct" w:w="8%"/>
-          </w:tcPr>
-          <w:p>
-            <w:pPr>
-              <w:jc w:val="left"/>
-            </w:pPr>
-            <w:r>
-              <w:rPr>
-                <w:rFonts w:ascii="Times New Roman" w:cs="Times New Roman" w:eastAsia="Times New Roman" w:hAnsi="Times New Roman"/>
-                <w:sz w:val="22"/>
-                <w:szCs w:val="22"/>
-              </w:rPr>
-              <w:t xml:space="preserve">лично</w:t>
+              <w:t xml:space="preserve">{item_3_sign}</w:t>
             </w:r>
           </w:p>
         </w:tc>
@@ -3641,31 +3659,13 @@
                 <w:sz w:val="22"/>
                 <w:szCs w:val="22"/>
               </w:rPr>
-              <w:t xml:space="preserve">{item_3_sign}</w:t>
-            </w:r>
-          </w:p>
-        </w:tc>
-        <w:tc>
-          <w:tcPr>
-            <w:tcW w:type="pct" w:w="10%"/>
-          </w:tcPr>
-          <w:p>
-            <w:pPr>
-              <w:jc w:val="left"/>
-            </w:pPr>
-            <w:r>
-              <w:rPr>
-                <w:rFonts w:ascii="Times New Roman" w:cs="Times New Roman" w:eastAsia="Times New Roman" w:hAnsi="Times New Roman"/>
-                <w:sz w:val="22"/>
-                <w:szCs w:val="22"/>
-              </w:rPr>
               <w:t xml:space="preserve">‒</w:t>
             </w:r>
           </w:p>
         </w:tc>
         <w:tc>
           <w:tcPr>
-            <w:tcW w:type="pct" w:w="10%"/>
+            <w:tcW w:type="pct" w:w="8%"/>
           </w:tcPr>
           <w:p>
             <w:pPr>
@@ -3701,7 +3701,7 @@
         </w:tc>
         <w:tc>
           <w:tcPr>
-            <w:tcW w:type="pct" w:w="8%"/>
+            <w:tcW w:type="pct" w:w="6%"/>
           </w:tcPr>
           <w:p>
             <w:pPr>
@@ -3721,7 +3721,7 @@
       <w:tr>
         <w:tc>
           <w:tcPr>
-            <w:tcW w:type="pct" w:w="16%"/>
+            <w:tcW w:type="pct" w:w="14%"/>
           </w:tcPr>
           <w:p>
             <w:pPr>
@@ -3739,7 +3739,7 @@
         </w:tc>
         <w:tc>
           <w:tcPr>
-            <w:tcW w:type="pct" w:w="14%"/>
+            <w:tcW w:type="pct" w:w="12%"/>
           </w:tcPr>
           <w:p>
             <w:pPr>
@@ -3757,6 +3757,60 @@
         </w:tc>
         <w:tc>
           <w:tcPr>
+            <w:tcW w:type="pct" w:w="12%"/>
+          </w:tcPr>
+          <w:p>
+            <w:pPr>
+              <w:jc w:val="left"/>
+            </w:pPr>
+            <w:r>
+              <w:rPr>
+                <w:rFonts w:ascii="Times New Roman" w:cs="Times New Roman" w:eastAsia="Times New Roman" w:hAnsi="Times New Roman"/>
+                <w:sz w:val="22"/>
+                <w:szCs w:val="22"/>
+              </w:rPr>
+              <w:t xml:space="preserve">{item_3_date}</w:t>
+            </w:r>
+          </w:p>
+        </w:tc>
+        <w:tc>
+          <w:tcPr>
+            <w:tcW w:type="pct" w:w="6%"/>
+          </w:tcPr>
+          <w:p>
+            <w:pPr>
+              <w:jc w:val="left"/>
+            </w:pPr>
+            <w:r>
+              <w:rPr>
+                <w:rFonts w:ascii="Times New Roman" w:cs="Times New Roman" w:eastAsia="Times New Roman" w:hAnsi="Times New Roman"/>
+                <w:sz w:val="22"/>
+                <w:szCs w:val="22"/>
+              </w:rPr>
+              <w:t xml:space="preserve">{item_3_qty}</w:t>
+            </w:r>
+          </w:p>
+        </w:tc>
+        <w:tc>
+          <w:tcPr>
+            <w:tcW w:type="pct" w:w="8%"/>
+          </w:tcPr>
+          <w:p>
+            <w:pPr>
+              <w:jc w:val="left"/>
+            </w:pPr>
+            <w:r>
+              <w:rPr>
+                <w:rFonts w:ascii="Times New Roman" w:cs="Times New Roman" w:eastAsia="Times New Roman" w:hAnsi="Times New Roman"/>
+                <w:sz w:val="22"/>
+                <w:szCs w:val="22"/>
+              </w:rPr>
+              <w:t xml:space="preserve">лично</w:t>
+            </w:r>
+          </w:p>
+        </w:tc>
+        <w:tc>
+          <w:tcPr>
             <w:tcW w:type="pct" w:w="10%"/>
           </w:tcPr>
           <w:p>
@@ -3769,43 +3823,7 @@
                 <w:sz w:val="22"/>
                 <w:szCs w:val="22"/>
               </w:rPr>
-              <w:t xml:space="preserve">{item_3_date}</w:t>
-            </w:r>
-          </w:p>
-        </w:tc>
-        <w:tc>
-          <w:tcPr>
-            <w:tcW w:type="pct" w:w="8%"/>
-          </w:tcPr>
-          <w:p>
-            <w:pPr>
-              <w:jc w:val="left"/>
-            </w:pPr>
-            <w:r>
-              <w:rPr>
-                <w:rFonts w:ascii="Times New Roman" w:cs="Times New Roman" w:eastAsia="Times New Roman" w:hAnsi="Times New Roman"/>
-                <w:sz w:val="22"/>
-                <w:szCs w:val="22"/>
-              </w:rPr>
-              <w:t xml:space="preserve">{item_3_qty}</w:t>
-            </w:r>
-          </w:p>
-        </w:tc>
-        <w:tc>
-          <w:tcPr>
-            <w:tcW w:type="pct" w:w="8%"/>
-          </w:tcPr>
-          <w:p>
-            <w:pPr>
-              <w:jc w:val="left"/>
-            </w:pPr>
-            <w:r>
-              <w:rPr>
-                <w:rFonts w:ascii="Times New Roman" w:cs="Times New Roman" w:eastAsia="Times New Roman" w:hAnsi="Times New Roman"/>
-                <w:sz w:val="22"/>
-                <w:szCs w:val="22"/>
-              </w:rPr>
-              <w:t xml:space="preserve">лично</w:t>
+              <w:t xml:space="preserve">{item_3_sign}</w:t>
             </w:r>
           </w:p>
         </w:tc>
@@ -3823,31 +3841,13 @@
                 <w:sz w:val="22"/>
                 <w:szCs w:val="22"/>
               </w:rPr>
-              <w:t xml:space="preserve">{item_3_sign}</w:t>
-            </w:r>
-          </w:p>
-        </w:tc>
-        <w:tc>
-          <w:tcPr>
-            <w:tcW w:type="pct" w:w="10%"/>
-          </w:tcPr>
-          <w:p>
-            <w:pPr>
-              <w:jc w:val="left"/>
-            </w:pPr>
-            <w:r>
-              <w:rPr>
-                <w:rFonts w:ascii="Times New Roman" w:cs="Times New Roman" w:eastAsia="Times New Roman" w:hAnsi="Times New Roman"/>
-                <w:sz w:val="22"/>
-                <w:szCs w:val="22"/>
-              </w:rPr>
               <w:t xml:space="preserve">‒</w:t>
             </w:r>
           </w:p>
         </w:tc>
         <w:tc>
           <w:tcPr>
-            <w:tcW w:type="pct" w:w="10%"/>
+            <w:tcW w:type="pct" w:w="8%"/>
           </w:tcPr>
           <w:p>
             <w:pPr>
@@ -3883,7 +3883,7 @@
         </w:tc>
         <w:tc>
           <w:tcPr>
-            <w:tcW w:type="pct" w:w="8%"/>
+            <w:tcW w:type="pct" w:w="6%"/>
           </w:tcPr>
           <w:p>
             <w:pPr>
@@ -3941,7 +3941,7 @@
       <w:tr>
         <w:tc>
           <w:tcPr>
-            <w:tcW w:type="pct" w:w="16%"/>
+            <w:tcW w:type="pct" w:w="14%"/>
           </w:tcPr>
           <w:p>
             <w:pPr>
@@ -3961,7 +3961,7 @@
         </w:tc>
         <w:tc>
           <w:tcPr>
-            <w:tcW w:type="pct" w:w="14%"/>
+            <w:tcW w:type="pct" w:w="12%"/>
           </w:tcPr>
           <w:p>
             <w:pPr>
@@ -3981,7 +3981,7 @@
         </w:tc>
         <w:tc>
           <w:tcPr>
-            <w:tcW w:type="pct" w:w="10%"/>
+            <w:tcW w:type="pct" w:w="12%"/>
           </w:tcPr>
           <w:p>
             <w:pPr>
@@ -4001,7 +4001,7 @@
         </w:tc>
         <w:tc>
           <w:tcPr>
-            <w:tcW w:type="pct" w:w="8%"/>
+            <w:tcW w:type="pct" w:w="6%"/>
           </w:tcPr>
           <w:p>
             <w:pPr>
@@ -4081,7 +4081,7 @@
         </w:tc>
         <w:tc>
           <w:tcPr>
-            <w:tcW w:type="pct" w:w="10%"/>
+            <w:tcW w:type="pct" w:w="8%"/>
           </w:tcPr>
           <w:p>
             <w:pPr>
@@ -4121,7 +4121,7 @@
         </w:tc>
         <w:tc>
           <w:tcPr>
-            <w:tcW w:type="pct" w:w="8%"/>
+            <w:tcW w:type="pct" w:w="6%"/>
           </w:tcPr>
           <w:p>
             <w:pPr>
@@ -4143,7 +4143,7 @@
       <w:tr>
         <w:tc>
           <w:tcPr>
-            <w:tcW w:type="pct" w:w="16%"/>
+            <w:tcW w:type="pct" w:w="14%"/>
           </w:tcPr>
           <w:p>
             <w:pPr>
@@ -4161,7 +4161,7 @@
         </w:tc>
         <w:tc>
           <w:tcPr>
-            <w:tcW w:type="pct" w:w="14%"/>
+            <w:tcW w:type="pct" w:w="12%"/>
           </w:tcPr>
           <w:p>
             <w:pPr>
@@ -4179,6 +4179,60 @@
         </w:tc>
         <w:tc>
           <w:tcPr>
+            <w:tcW w:type="pct" w:w="12%"/>
+          </w:tcPr>
+          <w:p>
+            <w:pPr>
+              <w:jc w:val="left"/>
+            </w:pPr>
+            <w:r>
+              <w:rPr>
+                <w:rFonts w:ascii="Times New Roman" w:cs="Times New Roman" w:eastAsia="Times New Roman" w:hAnsi="Times New Roman"/>
+                <w:sz w:val="22"/>
+                <w:szCs w:val="22"/>
+              </w:rPr>
+              <w:t xml:space="preserve">{item_4_date}</w:t>
+            </w:r>
+          </w:p>
+        </w:tc>
+        <w:tc>
+          <w:tcPr>
+            <w:tcW w:type="pct" w:w="6%"/>
+          </w:tcPr>
+          <w:p>
+            <w:pPr>
+              <w:jc w:val="left"/>
+            </w:pPr>
+            <w:r>
+              <w:rPr>
+                <w:rFonts w:ascii="Times New Roman" w:cs="Times New Roman" w:eastAsia="Times New Roman" w:hAnsi="Times New Roman"/>
+                <w:sz w:val="22"/>
+                <w:szCs w:val="22"/>
+              </w:rPr>
+              <w:t xml:space="preserve">{item_4_qty}</w:t>
+            </w:r>
+          </w:p>
+        </w:tc>
+        <w:tc>
+          <w:tcPr>
+            <w:tcW w:type="pct" w:w="8%"/>
+          </w:tcPr>
+          <w:p>
+            <w:pPr>
+              <w:jc w:val="left"/>
+            </w:pPr>
+            <w:r>
+              <w:rPr>
+                <w:rFonts w:ascii="Times New Roman" w:cs="Times New Roman" w:eastAsia="Times New Roman" w:hAnsi="Times New Roman"/>
+                <w:sz w:val="22"/>
+                <w:szCs w:val="22"/>
+              </w:rPr>
+              <w:t xml:space="preserve">лично</w:t>
+            </w:r>
+          </w:p>
+        </w:tc>
+        <w:tc>
+          <w:tcPr>
             <w:tcW w:type="pct" w:w="10%"/>
           </w:tcPr>
           <w:p>
@@ -4191,43 +4245,7 @@
                 <w:sz w:val="22"/>
                 <w:szCs w:val="22"/>
               </w:rPr>
-              <w:t xml:space="preserve">{item_4_date}</w:t>
-            </w:r>
-          </w:p>
-        </w:tc>
-        <w:tc>
-          <w:tcPr>
-            <w:tcW w:type="pct" w:w="8%"/>
-          </w:tcPr>
-          <w:p>
-            <w:pPr>
-              <w:jc w:val="left"/>
-            </w:pPr>
-            <w:r>
-              <w:rPr>
-                <w:rFonts w:ascii="Times New Roman" w:cs="Times New Roman" w:eastAsia="Times New Roman" w:hAnsi="Times New Roman"/>
-                <w:sz w:val="22"/>
-                <w:szCs w:val="22"/>
-              </w:rPr>
-              <w:t xml:space="preserve">{item_4_qty}</w:t>
-            </w:r>
-          </w:p>
-        </w:tc>
-        <w:tc>
-          <w:tcPr>
-            <w:tcW w:type="pct" w:w="8%"/>
-          </w:tcPr>
-          <w:p>
-            <w:pPr>
-              <w:jc w:val="left"/>
-            </w:pPr>
-            <w:r>
-              <w:rPr>
-                <w:rFonts w:ascii="Times New Roman" w:cs="Times New Roman" w:eastAsia="Times New Roman" w:hAnsi="Times New Roman"/>
-                <w:sz w:val="22"/>
-                <w:szCs w:val="22"/>
-              </w:rPr>
-              <w:t xml:space="preserve">лично</w:t>
+              <w:t xml:space="preserve">{item_4_sign}</w:t>
             </w:r>
           </w:p>
         </w:tc>
@@ -4245,31 +4263,13 @@
                 <w:sz w:val="22"/>
                 <w:szCs w:val="22"/>
               </w:rPr>
-              <w:t xml:space="preserve">{item_4_sign}</w:t>
-            </w:r>
-          </w:p>
-        </w:tc>
-        <w:tc>
-          <w:tcPr>
-            <w:tcW w:type="pct" w:w="10%"/>
-          </w:tcPr>
-          <w:p>
-            <w:pPr>
-              <w:jc w:val="left"/>
-            </w:pPr>
-            <w:r>
-              <w:rPr>
-                <w:rFonts w:ascii="Times New Roman" w:cs="Times New Roman" w:eastAsia="Times New Roman" w:hAnsi="Times New Roman"/>
-                <w:sz w:val="22"/>
-                <w:szCs w:val="22"/>
-              </w:rPr>
               <w:t xml:space="preserve">‒</w:t>
             </w:r>
           </w:p>
         </w:tc>
         <w:tc>
           <w:tcPr>
-            <w:tcW w:type="pct" w:w="10%"/>
+            <w:tcW w:type="pct" w:w="8%"/>
           </w:tcPr>
           <w:p>
             <w:pPr>
@@ -4305,7 +4305,7 @@
         </w:tc>
         <w:tc>
           <w:tcPr>
-            <w:tcW w:type="pct" w:w="8%"/>
+            <w:tcW w:type="pct" w:w="6%"/>
           </w:tcPr>
           <w:p>
             <w:pPr>
@@ -4325,7 +4325,7 @@
       <w:tr>
         <w:tc>
           <w:tcPr>
-            <w:tcW w:type="pct" w:w="16%"/>
+            <w:tcW w:type="pct" w:w="14%"/>
           </w:tcPr>
           <w:p>
             <w:pPr>
@@ -4343,7 +4343,7 @@
         </w:tc>
         <w:tc>
           <w:tcPr>
-            <w:tcW w:type="pct" w:w="14%"/>
+            <w:tcW w:type="pct" w:w="12%"/>
           </w:tcPr>
           <w:p>
             <w:pPr>
@@ -4361,6 +4361,60 @@
         </w:tc>
         <w:tc>
           <w:tcPr>
+            <w:tcW w:type="pct" w:w="12%"/>
+          </w:tcPr>
+          <w:p>
+            <w:pPr>
+              <w:jc w:val="left"/>
+            </w:pPr>
+            <w:r>
+              <w:rPr>
+                <w:rFonts w:ascii="Times New Roman" w:cs="Times New Roman" w:eastAsia="Times New Roman" w:hAnsi="Times New Roman"/>
+                <w:sz w:val="22"/>
+                <w:szCs w:val="22"/>
+              </w:rPr>
+              <w:t xml:space="preserve">{item_4_date}</w:t>
+            </w:r>
+          </w:p>
+        </w:tc>
+        <w:tc>
+          <w:tcPr>
+            <w:tcW w:type="pct" w:w="6%"/>
+          </w:tcPr>
+          <w:p>
+            <w:pPr>
+              <w:jc w:val="left"/>
+            </w:pPr>
+            <w:r>
+              <w:rPr>
+                <w:rFonts w:ascii="Times New Roman" w:cs="Times New Roman" w:eastAsia="Times New Roman" w:hAnsi="Times New Roman"/>
+                <w:sz w:val="22"/>
+                <w:szCs w:val="22"/>
+              </w:rPr>
+              <w:t xml:space="preserve">{item_4_qty}</w:t>
+            </w:r>
+          </w:p>
+        </w:tc>
+        <w:tc>
+          <w:tcPr>
+            <w:tcW w:type="pct" w:w="8%"/>
+          </w:tcPr>
+          <w:p>
+            <w:pPr>
+              <w:jc w:val="left"/>
+            </w:pPr>
+            <w:r>
+              <w:rPr>
+                <w:rFonts w:ascii="Times New Roman" w:cs="Times New Roman" w:eastAsia="Times New Roman" w:hAnsi="Times New Roman"/>
+                <w:sz w:val="22"/>
+                <w:szCs w:val="22"/>
+              </w:rPr>
+              <w:t xml:space="preserve">лично</w:t>
+            </w:r>
+          </w:p>
+        </w:tc>
+        <w:tc>
+          <w:tcPr>
             <w:tcW w:type="pct" w:w="10%"/>
           </w:tcPr>
           <w:p>
@@ -4373,43 +4427,7 @@
                 <w:sz w:val="22"/>
                 <w:szCs w:val="22"/>
               </w:rPr>
-              <w:t xml:space="preserve">{item_4_date}</w:t>
-            </w:r>
-          </w:p>
-        </w:tc>
-        <w:tc>
-          <w:tcPr>
-            <w:tcW w:type="pct" w:w="8%"/>
-          </w:tcPr>
-          <w:p>
-            <w:pPr>
-              <w:jc w:val="left"/>
-            </w:pPr>
-            <w:r>
-              <w:rPr>
-                <w:rFonts w:ascii="Times New Roman" w:cs="Times New Roman" w:eastAsia="Times New Roman" w:hAnsi="Times New Roman"/>
-                <w:sz w:val="22"/>
-                <w:szCs w:val="22"/>
-              </w:rPr>
-              <w:t xml:space="preserve">{item_4_qty}</w:t>
-            </w:r>
-          </w:p>
-        </w:tc>
-        <w:tc>
-          <w:tcPr>
-            <w:tcW w:type="pct" w:w="8%"/>
-          </w:tcPr>
-          <w:p>
-            <w:pPr>
-              <w:jc w:val="left"/>
-            </w:pPr>
-            <w:r>
-              <w:rPr>
-                <w:rFonts w:ascii="Times New Roman" w:cs="Times New Roman" w:eastAsia="Times New Roman" w:hAnsi="Times New Roman"/>
-                <w:sz w:val="22"/>
-                <w:szCs w:val="22"/>
-              </w:rPr>
-              <w:t xml:space="preserve">лично</w:t>
+              <w:t xml:space="preserve">{item_4_sign}</w:t>
             </w:r>
           </w:p>
         </w:tc>
@@ -4427,31 +4445,13 @@
                 <w:sz w:val="22"/>
                 <w:szCs w:val="22"/>
               </w:rPr>
-              <w:t xml:space="preserve">{item_4_sign}</w:t>
-            </w:r>
-          </w:p>
-        </w:tc>
-        <w:tc>
-          <w:tcPr>
-            <w:tcW w:type="pct" w:w="10%"/>
-          </w:tcPr>
-          <w:p>
-            <w:pPr>
-              <w:jc w:val="left"/>
-            </w:pPr>
-            <w:r>
-              <w:rPr>
-                <w:rFonts w:ascii="Times New Roman" w:cs="Times New Roman" w:eastAsia="Times New Roman" w:hAnsi="Times New Roman"/>
-                <w:sz w:val="22"/>
-                <w:szCs w:val="22"/>
-              </w:rPr>
               <w:t xml:space="preserve">‒</w:t>
             </w:r>
           </w:p>
         </w:tc>
         <w:tc>
           <w:tcPr>
-            <w:tcW w:type="pct" w:w="10%"/>
+            <w:tcW w:type="pct" w:w="8%"/>
           </w:tcPr>
           <w:p>
             <w:pPr>
@@ -4487,7 +4487,7 @@
         </w:tc>
         <w:tc>
           <w:tcPr>
-            <w:tcW w:type="pct" w:w="8%"/>
+            <w:tcW w:type="pct" w:w="6%"/>
           </w:tcPr>
           <w:p>
             <w:pPr>
@@ -4507,7 +4507,7 @@
       <w:tr>
         <w:tc>
           <w:tcPr>
-            <w:tcW w:type="pct" w:w="16%"/>
+            <w:tcW w:type="pct" w:w="14%"/>
           </w:tcPr>
           <w:p>
             <w:pPr>
@@ -4525,7 +4525,7 @@
         </w:tc>
         <w:tc>
           <w:tcPr>
-            <w:tcW w:type="pct" w:w="14%"/>
+            <w:tcW w:type="pct" w:w="12%"/>
           </w:tcPr>
           <w:p>
             <w:pPr>
@@ -4543,6 +4543,60 @@
         </w:tc>
         <w:tc>
           <w:tcPr>
+            <w:tcW w:type="pct" w:w="12%"/>
+          </w:tcPr>
+          <w:p>
+            <w:pPr>
+              <w:jc w:val="left"/>
+            </w:pPr>
+            <w:r>
+              <w:rPr>
+                <w:rFonts w:ascii="Times New Roman" w:cs="Times New Roman" w:eastAsia="Times New Roman" w:hAnsi="Times New Roman"/>
+                <w:sz w:val="22"/>
+                <w:szCs w:val="22"/>
+              </w:rPr>
+              <w:t xml:space="preserve">{item_4_date}</w:t>
+            </w:r>
+          </w:p>
+        </w:tc>
+        <w:tc>
+          <w:tcPr>
+            <w:tcW w:type="pct" w:w="6%"/>
+          </w:tcPr>
+          <w:p>
+            <w:pPr>
+              <w:jc w:val="left"/>
+            </w:pPr>
+            <w:r>
+              <w:rPr>
+                <w:rFonts w:ascii="Times New Roman" w:cs="Times New Roman" w:eastAsia="Times New Roman" w:hAnsi="Times New Roman"/>
+                <w:sz w:val="22"/>
+                <w:szCs w:val="22"/>
+              </w:rPr>
+              <w:t xml:space="preserve">{item_4_qty}</w:t>
+            </w:r>
+          </w:p>
+        </w:tc>
+        <w:tc>
+          <w:tcPr>
+            <w:tcW w:type="pct" w:w="8%"/>
+          </w:tcPr>
+          <w:p>
+            <w:pPr>
+              <w:jc w:val="left"/>
+            </w:pPr>
+            <w:r>
+              <w:rPr>
+                <w:rFonts w:ascii="Times New Roman" w:cs="Times New Roman" w:eastAsia="Times New Roman" w:hAnsi="Times New Roman"/>
+                <w:sz w:val="22"/>
+                <w:szCs w:val="22"/>
+              </w:rPr>
+              <w:t xml:space="preserve">лично</w:t>
+            </w:r>
+          </w:p>
+        </w:tc>
+        <w:tc>
+          <w:tcPr>
             <w:tcW w:type="pct" w:w="10%"/>
           </w:tcPr>
           <w:p>
@@ -4555,43 +4609,7 @@
                 <w:sz w:val="22"/>
                 <w:szCs w:val="22"/>
               </w:rPr>
-              <w:t xml:space="preserve">{item_4_date}</w:t>
-            </w:r>
-          </w:p>
-        </w:tc>
-        <w:tc>
-          <w:tcPr>
-            <w:tcW w:type="pct" w:w="8%"/>
-          </w:tcPr>
-          <w:p>
-            <w:pPr>
-              <w:jc w:val="left"/>
-            </w:pPr>
-            <w:r>
-              <w:rPr>
-                <w:rFonts w:ascii="Times New Roman" w:cs="Times New Roman" w:eastAsia="Times New Roman" w:hAnsi="Times New Roman"/>
-                <w:sz w:val="22"/>
-                <w:szCs w:val="22"/>
-              </w:rPr>
-              <w:t xml:space="preserve">{item_4_qty}</w:t>
-            </w:r>
-          </w:p>
-        </w:tc>
-        <w:tc>
-          <w:tcPr>
-            <w:tcW w:type="pct" w:w="8%"/>
-          </w:tcPr>
-          <w:p>
-            <w:pPr>
-              <w:jc w:val="left"/>
-            </w:pPr>
-            <w:r>
-              <w:rPr>
-                <w:rFonts w:ascii="Times New Roman" w:cs="Times New Roman" w:eastAsia="Times New Roman" w:hAnsi="Times New Roman"/>
-                <w:sz w:val="22"/>
-                <w:szCs w:val="22"/>
-              </w:rPr>
-              <w:t xml:space="preserve">лично</w:t>
+              <w:t xml:space="preserve">{item_4_sign}</w:t>
             </w:r>
           </w:p>
         </w:tc>
@@ -4609,31 +4627,13 @@
                 <w:sz w:val="22"/>
                 <w:szCs w:val="22"/>
               </w:rPr>
-              <w:t xml:space="preserve">{item_4_sign}</w:t>
-            </w:r>
-          </w:p>
-        </w:tc>
-        <w:tc>
-          <w:tcPr>
-            <w:tcW w:type="pct" w:w="10%"/>
-          </w:tcPr>
-          <w:p>
-            <w:pPr>
-              <w:jc w:val="left"/>
-            </w:pPr>
-            <w:r>
-              <w:rPr>
-                <w:rFonts w:ascii="Times New Roman" w:cs="Times New Roman" w:eastAsia="Times New Roman" w:hAnsi="Times New Roman"/>
-                <w:sz w:val="22"/>
-                <w:szCs w:val="22"/>
-              </w:rPr>
               <w:t xml:space="preserve">‒</w:t>
             </w:r>
           </w:p>
         </w:tc>
         <w:tc>
           <w:tcPr>
-            <w:tcW w:type="pct" w:w="10%"/>
+            <w:tcW w:type="pct" w:w="8%"/>
           </w:tcPr>
           <w:p>
             <w:pPr>
@@ -4669,7 +4669,7 @@
         </w:tc>
         <w:tc>
           <w:tcPr>
-            <w:tcW w:type="pct" w:w="8%"/>
+            <w:tcW w:type="pct" w:w="6%"/>
           </w:tcPr>
           <w:p>
             <w:pPr>
@@ -4689,7 +4689,7 @@
       <w:tr>
         <w:tc>
           <w:tcPr>
-            <w:tcW w:type="pct" w:w="16%"/>
+            <w:tcW w:type="pct" w:w="14%"/>
           </w:tcPr>
           <w:p>
             <w:pPr>
@@ -4707,7 +4707,7 @@
         </w:tc>
         <w:tc>
           <w:tcPr>
-            <w:tcW w:type="pct" w:w="14%"/>
+            <w:tcW w:type="pct" w:w="12%"/>
           </w:tcPr>
           <w:p>
             <w:pPr>
@@ -4725,6 +4725,60 @@
         </w:tc>
         <w:tc>
           <w:tcPr>
+            <w:tcW w:type="pct" w:w="12%"/>
+          </w:tcPr>
+          <w:p>
+            <w:pPr>
+              <w:jc w:val="left"/>
+            </w:pPr>
+            <w:r>
+              <w:rPr>
+                <w:rFonts w:ascii="Times New Roman" w:cs="Times New Roman" w:eastAsia="Times New Roman" w:hAnsi="Times New Roman"/>
+                <w:sz w:val="22"/>
+                <w:szCs w:val="22"/>
+              </w:rPr>
+              <w:t xml:space="preserve">{item_4_date}</w:t>
+            </w:r>
+          </w:p>
+        </w:tc>
+        <w:tc>
+          <w:tcPr>
+            <w:tcW w:type="pct" w:w="6%"/>
+          </w:tcPr>
+          <w:p>
+            <w:pPr>
+              <w:jc w:val="left"/>
+            </w:pPr>
+            <w:r>
+              <w:rPr>
+                <w:rFonts w:ascii="Times New Roman" w:cs="Times New Roman" w:eastAsia="Times New Roman" w:hAnsi="Times New Roman"/>
+                <w:sz w:val="22"/>
+                <w:szCs w:val="22"/>
+              </w:rPr>
+              <w:t xml:space="preserve">{item_4_qty}</w:t>
+            </w:r>
+          </w:p>
+        </w:tc>
+        <w:tc>
+          <w:tcPr>
+            <w:tcW w:type="pct" w:w="8%"/>
+          </w:tcPr>
+          <w:p>
+            <w:pPr>
+              <w:jc w:val="left"/>
+            </w:pPr>
+            <w:r>
+              <w:rPr>
+                <w:rFonts w:ascii="Times New Roman" w:cs="Times New Roman" w:eastAsia="Times New Roman" w:hAnsi="Times New Roman"/>
+                <w:sz w:val="22"/>
+                <w:szCs w:val="22"/>
+              </w:rPr>
+              <w:t xml:space="preserve">лично</w:t>
+            </w:r>
+          </w:p>
+        </w:tc>
+        <w:tc>
+          <w:tcPr>
             <w:tcW w:type="pct" w:w="10%"/>
           </w:tcPr>
           <w:p>
@@ -4737,43 +4791,7 @@
                 <w:sz w:val="22"/>
                 <w:szCs w:val="22"/>
               </w:rPr>
-              <w:t xml:space="preserve">{item_4_date}</w:t>
-            </w:r>
-          </w:p>
-        </w:tc>
-        <w:tc>
-          <w:tcPr>
-            <w:tcW w:type="pct" w:w="8%"/>
-          </w:tcPr>
-          <w:p>
-            <w:pPr>
-              <w:jc w:val="left"/>
-            </w:pPr>
-            <w:r>
-              <w:rPr>
-                <w:rFonts w:ascii="Times New Roman" w:cs="Times New Roman" w:eastAsia="Times New Roman" w:hAnsi="Times New Roman"/>
-                <w:sz w:val="22"/>
-                <w:szCs w:val="22"/>
-              </w:rPr>
-              <w:t xml:space="preserve">{item_4_qty}</w:t>
-            </w:r>
-          </w:p>
-        </w:tc>
-        <w:tc>
-          <w:tcPr>
-            <w:tcW w:type="pct" w:w="8%"/>
-          </w:tcPr>
-          <w:p>
-            <w:pPr>
-              <w:jc w:val="left"/>
-            </w:pPr>
-            <w:r>
-              <w:rPr>
-                <w:rFonts w:ascii="Times New Roman" w:cs="Times New Roman" w:eastAsia="Times New Roman" w:hAnsi="Times New Roman"/>
-                <w:sz w:val="22"/>
-                <w:szCs w:val="22"/>
-              </w:rPr>
-              <w:t xml:space="preserve">лично</w:t>
+              <w:t xml:space="preserve">{item_4_sign}</w:t>
             </w:r>
           </w:p>
         </w:tc>
@@ -4791,31 +4809,13 @@
                 <w:sz w:val="22"/>
                 <w:szCs w:val="22"/>
               </w:rPr>
-              <w:t xml:space="preserve">{item_4_sign}</w:t>
-            </w:r>
-          </w:p>
-        </w:tc>
-        <w:tc>
-          <w:tcPr>
-            <w:tcW w:type="pct" w:w="10%"/>
-          </w:tcPr>
-          <w:p>
-            <w:pPr>
-              <w:jc w:val="left"/>
-            </w:pPr>
-            <w:r>
-              <w:rPr>
-                <w:rFonts w:ascii="Times New Roman" w:cs="Times New Roman" w:eastAsia="Times New Roman" w:hAnsi="Times New Roman"/>
-                <w:sz w:val="22"/>
-                <w:szCs w:val="22"/>
-              </w:rPr>
               <w:t xml:space="preserve">‒</w:t>
             </w:r>
           </w:p>
         </w:tc>
         <w:tc>
           <w:tcPr>
-            <w:tcW w:type="pct" w:w="10%"/>
+            <w:tcW w:type="pct" w:w="8%"/>
           </w:tcPr>
           <w:p>
             <w:pPr>
@@ -4851,7 +4851,7 @@
         </w:tc>
         <w:tc>
           <w:tcPr>
-            <w:tcW w:type="pct" w:w="8%"/>
+            <w:tcW w:type="pct" w:w="6%"/>
           </w:tcPr>
           <w:p>
             <w:pPr>
@@ -4909,7 +4909,7 @@
       <w:tr>
         <w:tc>
           <w:tcPr>
-            <w:tcW w:type="pct" w:w="16%"/>
+            <w:tcW w:type="pct" w:w="14%"/>
           </w:tcPr>
           <w:p>
             <w:pPr>
@@ -4929,7 +4929,7 @@
         </w:tc>
         <w:tc>
           <w:tcPr>
-            <w:tcW w:type="pct" w:w="14%"/>
+            <w:tcW w:type="pct" w:w="12%"/>
           </w:tcPr>
           <w:p>
             <w:pPr>
@@ -4949,7 +4949,7 @@
         </w:tc>
         <w:tc>
           <w:tcPr>
-            <w:tcW w:type="pct" w:w="10%"/>
+            <w:tcW w:type="pct" w:w="12%"/>
           </w:tcPr>
           <w:p>
             <w:pPr>
@@ -4969,7 +4969,7 @@
         </w:tc>
         <w:tc>
           <w:tcPr>
-            <w:tcW w:type="pct" w:w="8%"/>
+            <w:tcW w:type="pct" w:w="6%"/>
           </w:tcPr>
           <w:p>
             <w:pPr>
@@ -5049,7 +5049,7 @@
         </w:tc>
         <w:tc>
           <w:tcPr>
-            <w:tcW w:type="pct" w:w="10%"/>
+            <w:tcW w:type="pct" w:w="8%"/>
           </w:tcPr>
           <w:p>
             <w:pPr>
@@ -5089,7 +5089,7 @@
         </w:tc>
         <w:tc>
           <w:tcPr>
-            <w:tcW w:type="pct" w:w="8%"/>
+            <w:tcW w:type="pct" w:w="6%"/>
           </w:tcPr>
           <w:p>
             <w:pPr>
@@ -5111,7 +5111,7 @@
       <w:tr>
         <w:tc>
           <w:tcPr>
-            <w:tcW w:type="pct" w:w="16%"/>
+            <w:tcW w:type="pct" w:w="14%"/>
           </w:tcPr>
           <w:p>
             <w:pPr>
@@ -5129,7 +5129,7 @@
         </w:tc>
         <w:tc>
           <w:tcPr>
-            <w:tcW w:type="pct" w:w="14%"/>
+            <w:tcW w:type="pct" w:w="12%"/>
           </w:tcPr>
           <w:p>
             <w:pPr>
@@ -5147,6 +5147,60 @@
         </w:tc>
         <w:tc>
           <w:tcPr>
+            <w:tcW w:type="pct" w:w="12%"/>
+          </w:tcPr>
+          <w:p>
+            <w:pPr>
+              <w:jc w:val="left"/>
+            </w:pPr>
+            <w:r>
+              <w:rPr>
+                <w:rFonts w:ascii="Times New Roman" w:cs="Times New Roman" w:eastAsia="Times New Roman" w:hAnsi="Times New Roman"/>
+                <w:sz w:val="22"/>
+                <w:szCs w:val="22"/>
+              </w:rPr>
+              <w:t xml:space="preserve">{item_5_date}</w:t>
+            </w:r>
+          </w:p>
+        </w:tc>
+        <w:tc>
+          <w:tcPr>
+            <w:tcW w:type="pct" w:w="6%"/>
+          </w:tcPr>
+          <w:p>
+            <w:pPr>
+              <w:jc w:val="left"/>
+            </w:pPr>
+            <w:r>
+              <w:rPr>
+                <w:rFonts w:ascii="Times New Roman" w:cs="Times New Roman" w:eastAsia="Times New Roman" w:hAnsi="Times New Roman"/>
+                <w:sz w:val="22"/>
+                <w:szCs w:val="22"/>
+              </w:rPr>
+              <w:t xml:space="preserve">{item_5_qty}</w:t>
+            </w:r>
+          </w:p>
+        </w:tc>
+        <w:tc>
+          <w:tcPr>
+            <w:tcW w:type="pct" w:w="8%"/>
+          </w:tcPr>
+          <w:p>
+            <w:pPr>
+              <w:jc w:val="left"/>
+            </w:pPr>
+            <w:r>
+              <w:rPr>
+                <w:rFonts w:ascii="Times New Roman" w:cs="Times New Roman" w:eastAsia="Times New Roman" w:hAnsi="Times New Roman"/>
+                <w:sz w:val="22"/>
+                <w:szCs w:val="22"/>
+              </w:rPr>
+              <w:t xml:space="preserve">лично</w:t>
+            </w:r>
+          </w:p>
+        </w:tc>
+        <w:tc>
+          <w:tcPr>
             <w:tcW w:type="pct" w:w="10%"/>
           </w:tcPr>
           <w:p>
@@ -5159,43 +5213,7 @@
                 <w:sz w:val="22"/>
                 <w:szCs w:val="22"/>
               </w:rPr>
-              <w:t xml:space="preserve">{item_5_date}</w:t>
-            </w:r>
-          </w:p>
-        </w:tc>
-        <w:tc>
-          <w:tcPr>
-            <w:tcW w:type="pct" w:w="8%"/>
-          </w:tcPr>
-          <w:p>
-            <w:pPr>
-              <w:jc w:val="left"/>
-            </w:pPr>
-            <w:r>
-              <w:rPr>
-                <w:rFonts w:ascii="Times New Roman" w:cs="Times New Roman" w:eastAsia="Times New Roman" w:hAnsi="Times New Roman"/>
-                <w:sz w:val="22"/>
-                <w:szCs w:val="22"/>
-              </w:rPr>
-              <w:t xml:space="preserve">{item_5_qty}</w:t>
-            </w:r>
-          </w:p>
-        </w:tc>
-        <w:tc>
-          <w:tcPr>
-            <w:tcW w:type="pct" w:w="8%"/>
-          </w:tcPr>
-          <w:p>
-            <w:pPr>
-              <w:jc w:val="left"/>
-            </w:pPr>
-            <w:r>
-              <w:rPr>
-                <w:rFonts w:ascii="Times New Roman" w:cs="Times New Roman" w:eastAsia="Times New Roman" w:hAnsi="Times New Roman"/>
-                <w:sz w:val="22"/>
-                <w:szCs w:val="22"/>
-              </w:rPr>
-              <w:t xml:space="preserve">лично</w:t>
+              <w:t xml:space="preserve">{item_5_sign}</w:t>
             </w:r>
           </w:p>
         </w:tc>
@@ -5213,31 +5231,13 @@
                 <w:sz w:val="22"/>
                 <w:szCs w:val="22"/>
               </w:rPr>
-              <w:t xml:space="preserve">{item_5_sign}</w:t>
-            </w:r>
-          </w:p>
-        </w:tc>
-        <w:tc>
-          <w:tcPr>
-            <w:tcW w:type="pct" w:w="10%"/>
-          </w:tcPr>
-          <w:p>
-            <w:pPr>
-              <w:jc w:val="left"/>
-            </w:pPr>
-            <w:r>
-              <w:rPr>
-                <w:rFonts w:ascii="Times New Roman" w:cs="Times New Roman" w:eastAsia="Times New Roman" w:hAnsi="Times New Roman"/>
-                <w:sz w:val="22"/>
-                <w:szCs w:val="22"/>
-              </w:rPr>
               <w:t xml:space="preserve">‒</w:t>
             </w:r>
           </w:p>
         </w:tc>
         <w:tc>
           <w:tcPr>
-            <w:tcW w:type="pct" w:w="10%"/>
+            <w:tcW w:type="pct" w:w="8%"/>
           </w:tcPr>
           <w:p>
             <w:pPr>
@@ -5273,7 +5273,7 @@
         </w:tc>
         <w:tc>
           <w:tcPr>
-            <w:tcW w:type="pct" w:w="8%"/>
+            <w:tcW w:type="pct" w:w="6%"/>
           </w:tcPr>
           <w:p>
             <w:pPr>
@@ -5293,7 +5293,7 @@
       <w:tr>
         <w:tc>
           <w:tcPr>
-            <w:tcW w:type="pct" w:w="16%"/>
+            <w:tcW w:type="pct" w:w="14%"/>
           </w:tcPr>
           <w:p>
             <w:pPr>
@@ -5311,7 +5311,7 @@
         </w:tc>
         <w:tc>
           <w:tcPr>
-            <w:tcW w:type="pct" w:w="14%"/>
+            <w:tcW w:type="pct" w:w="12%"/>
           </w:tcPr>
           <w:p>
             <w:pPr>
@@ -5329,6 +5329,60 @@
         </w:tc>
         <w:tc>
           <w:tcPr>
+            <w:tcW w:type="pct" w:w="12%"/>
+          </w:tcPr>
+          <w:p>
+            <w:pPr>
+              <w:jc w:val="left"/>
+            </w:pPr>
+            <w:r>
+              <w:rPr>
+                <w:rFonts w:ascii="Times New Roman" w:cs="Times New Roman" w:eastAsia="Times New Roman" w:hAnsi="Times New Roman"/>
+                <w:sz w:val="22"/>
+                <w:szCs w:val="22"/>
+              </w:rPr>
+              <w:t xml:space="preserve">{item_5_date}</w:t>
+            </w:r>
+          </w:p>
+        </w:tc>
+        <w:tc>
+          <w:tcPr>
+            <w:tcW w:type="pct" w:w="6%"/>
+          </w:tcPr>
+          <w:p>
+            <w:pPr>
+              <w:jc w:val="left"/>
+            </w:pPr>
+            <w:r>
+              <w:rPr>
+                <w:rFonts w:ascii="Times New Roman" w:cs="Times New Roman" w:eastAsia="Times New Roman" w:hAnsi="Times New Roman"/>
+                <w:sz w:val="22"/>
+                <w:szCs w:val="22"/>
+              </w:rPr>
+              <w:t xml:space="preserve">{item_5_qty}</w:t>
+            </w:r>
+          </w:p>
+        </w:tc>
+        <w:tc>
+          <w:tcPr>
+            <w:tcW w:type="pct" w:w="8%"/>
+          </w:tcPr>
+          <w:p>
+            <w:pPr>
+              <w:jc w:val="left"/>
+            </w:pPr>
+            <w:r>
+              <w:rPr>
+                <w:rFonts w:ascii="Times New Roman" w:cs="Times New Roman" w:eastAsia="Times New Roman" w:hAnsi="Times New Roman"/>
+                <w:sz w:val="22"/>
+                <w:szCs w:val="22"/>
+              </w:rPr>
+              <w:t xml:space="preserve">лично</w:t>
+            </w:r>
+          </w:p>
+        </w:tc>
+        <w:tc>
+          <w:tcPr>
             <w:tcW w:type="pct" w:w="10%"/>
           </w:tcPr>
           <w:p>
@@ -5341,43 +5395,7 @@
                 <w:sz w:val="22"/>
                 <w:szCs w:val="22"/>
               </w:rPr>
-              <w:t xml:space="preserve">{item_5_date}</w:t>
-            </w:r>
-          </w:p>
-        </w:tc>
-        <w:tc>
-          <w:tcPr>
-            <w:tcW w:type="pct" w:w="8%"/>
-          </w:tcPr>
-          <w:p>
-            <w:pPr>
-              <w:jc w:val="left"/>
-            </w:pPr>
-            <w:r>
-              <w:rPr>
-                <w:rFonts w:ascii="Times New Roman" w:cs="Times New Roman" w:eastAsia="Times New Roman" w:hAnsi="Times New Roman"/>
-                <w:sz w:val="22"/>
-                <w:szCs w:val="22"/>
-              </w:rPr>
-              <w:t xml:space="preserve">{item_5_qty}</w:t>
-            </w:r>
-          </w:p>
-        </w:tc>
-        <w:tc>
-          <w:tcPr>
-            <w:tcW w:type="pct" w:w="8%"/>
-          </w:tcPr>
-          <w:p>
-            <w:pPr>
-              <w:jc w:val="left"/>
-            </w:pPr>
-            <w:r>
-              <w:rPr>
-                <w:rFonts w:ascii="Times New Roman" w:cs="Times New Roman" w:eastAsia="Times New Roman" w:hAnsi="Times New Roman"/>
-                <w:sz w:val="22"/>
-                <w:szCs w:val="22"/>
-              </w:rPr>
-              <w:t xml:space="preserve">лично</w:t>
+              <w:t xml:space="preserve">{item_5_sign}</w:t>
             </w:r>
           </w:p>
         </w:tc>
@@ -5395,31 +5413,13 @@
                 <w:sz w:val="22"/>
                 <w:szCs w:val="22"/>
               </w:rPr>
-              <w:t xml:space="preserve">{item_5_sign}</w:t>
-            </w:r>
-          </w:p>
-        </w:tc>
-        <w:tc>
-          <w:tcPr>
-            <w:tcW w:type="pct" w:w="10%"/>
-          </w:tcPr>
-          <w:p>
-            <w:pPr>
-              <w:jc w:val="left"/>
-            </w:pPr>
-            <w:r>
-              <w:rPr>
-                <w:rFonts w:ascii="Times New Roman" w:cs="Times New Roman" w:eastAsia="Times New Roman" w:hAnsi="Times New Roman"/>
-                <w:sz w:val="22"/>
-                <w:szCs w:val="22"/>
-              </w:rPr>
               <w:t xml:space="preserve">‒</w:t>
             </w:r>
           </w:p>
         </w:tc>
         <w:tc>
           <w:tcPr>
-            <w:tcW w:type="pct" w:w="10%"/>
+            <w:tcW w:type="pct" w:w="8%"/>
           </w:tcPr>
           <w:p>
             <w:pPr>
@@ -5455,7 +5455,7 @@
         </w:tc>
         <w:tc>
           <w:tcPr>
-            <w:tcW w:type="pct" w:w="8%"/>
+            <w:tcW w:type="pct" w:w="6%"/>
           </w:tcPr>
           <w:p>
             <w:pPr>
@@ -5475,7 +5475,7 @@
       <w:tr>
         <w:tc>
           <w:tcPr>
-            <w:tcW w:type="pct" w:w="16%"/>
+            <w:tcW w:type="pct" w:w="14%"/>
           </w:tcPr>
           <w:p>
             <w:pPr>
@@ -5493,7 +5493,7 @@
         </w:tc>
         <w:tc>
           <w:tcPr>
-            <w:tcW w:type="pct" w:w="14%"/>
+            <w:tcW w:type="pct" w:w="12%"/>
           </w:tcPr>
           <w:p>
             <w:pPr>
@@ -5511,6 +5511,60 @@
         </w:tc>
         <w:tc>
           <w:tcPr>
+            <w:tcW w:type="pct" w:w="12%"/>
+          </w:tcPr>
+          <w:p>
+            <w:pPr>
+              <w:jc w:val="left"/>
+            </w:pPr>
+            <w:r>
+              <w:rPr>
+                <w:rFonts w:ascii="Times New Roman" w:cs="Times New Roman" w:eastAsia="Times New Roman" w:hAnsi="Times New Roman"/>
+                <w:sz w:val="22"/>
+                <w:szCs w:val="22"/>
+              </w:rPr>
+              <w:t xml:space="preserve">{item_5_date}</w:t>
+            </w:r>
+          </w:p>
+        </w:tc>
+        <w:tc>
+          <w:tcPr>
+            <w:tcW w:type="pct" w:w="6%"/>
+          </w:tcPr>
+          <w:p>
+            <w:pPr>
+              <w:jc w:val="left"/>
+            </w:pPr>
+            <w:r>
+              <w:rPr>
+                <w:rFonts w:ascii="Times New Roman" w:cs="Times New Roman" w:eastAsia="Times New Roman" w:hAnsi="Times New Roman"/>
+                <w:sz w:val="22"/>
+                <w:szCs w:val="22"/>
+              </w:rPr>
+              <w:t xml:space="preserve">{item_5_qty}</w:t>
+            </w:r>
+          </w:p>
+        </w:tc>
+        <w:tc>
+          <w:tcPr>
+            <w:tcW w:type="pct" w:w="8%"/>
+          </w:tcPr>
+          <w:p>
+            <w:pPr>
+              <w:jc w:val="left"/>
+            </w:pPr>
+            <w:r>
+              <w:rPr>
+                <w:rFonts w:ascii="Times New Roman" w:cs="Times New Roman" w:eastAsia="Times New Roman" w:hAnsi="Times New Roman"/>
+                <w:sz w:val="22"/>
+                <w:szCs w:val="22"/>
+              </w:rPr>
+              <w:t xml:space="preserve">лично</w:t>
+            </w:r>
+          </w:p>
+        </w:tc>
+        <w:tc>
+          <w:tcPr>
             <w:tcW w:type="pct" w:w="10%"/>
           </w:tcPr>
           <w:p>
@@ -5523,43 +5577,7 @@
                 <w:sz w:val="22"/>
                 <w:szCs w:val="22"/>
               </w:rPr>
-              <w:t xml:space="preserve">{item_5_date}</w:t>
-            </w:r>
-          </w:p>
-        </w:tc>
-        <w:tc>
-          <w:tcPr>
-            <w:tcW w:type="pct" w:w="8%"/>
-          </w:tcPr>
-          <w:p>
-            <w:pPr>
-              <w:jc w:val="left"/>
-            </w:pPr>
-            <w:r>
-              <w:rPr>
-                <w:rFonts w:ascii="Times New Roman" w:cs="Times New Roman" w:eastAsia="Times New Roman" w:hAnsi="Times New Roman"/>
-                <w:sz w:val="22"/>
-                <w:szCs w:val="22"/>
-              </w:rPr>
-              <w:t xml:space="preserve">{item_5_qty}</w:t>
-            </w:r>
-          </w:p>
-        </w:tc>
-        <w:tc>
-          <w:tcPr>
-            <w:tcW w:type="pct" w:w="8%"/>
-          </w:tcPr>
-          <w:p>
-            <w:pPr>
-              <w:jc w:val="left"/>
-            </w:pPr>
-            <w:r>
-              <w:rPr>
-                <w:rFonts w:ascii="Times New Roman" w:cs="Times New Roman" w:eastAsia="Times New Roman" w:hAnsi="Times New Roman"/>
-                <w:sz w:val="22"/>
-                <w:szCs w:val="22"/>
-              </w:rPr>
-              <w:t xml:space="preserve">лично</w:t>
+              <w:t xml:space="preserve">{item_5_sign}</w:t>
             </w:r>
           </w:p>
         </w:tc>
@@ -5577,31 +5595,13 @@
                 <w:sz w:val="22"/>
                 <w:szCs w:val="22"/>
               </w:rPr>
-              <w:t xml:space="preserve">{item_5_sign}</w:t>
-            </w:r>
-          </w:p>
-        </w:tc>
-        <w:tc>
-          <w:tcPr>
-            <w:tcW w:type="pct" w:w="10%"/>
-          </w:tcPr>
-          <w:p>
-            <w:pPr>
-              <w:jc w:val="left"/>
-            </w:pPr>
-            <w:r>
-              <w:rPr>
-                <w:rFonts w:ascii="Times New Roman" w:cs="Times New Roman" w:eastAsia="Times New Roman" w:hAnsi="Times New Roman"/>
-                <w:sz w:val="22"/>
-                <w:szCs w:val="22"/>
-              </w:rPr>
               <w:t xml:space="preserve">‒</w:t>
             </w:r>
           </w:p>
         </w:tc>
         <w:tc>
           <w:tcPr>
-            <w:tcW w:type="pct" w:w="10%"/>
+            <w:tcW w:type="pct" w:w="8%"/>
           </w:tcPr>
           <w:p>
             <w:pPr>
@@ -5637,7 +5637,7 @@
         </w:tc>
         <w:tc>
           <w:tcPr>
-            <w:tcW w:type="pct" w:w="8%"/>
+            <w:tcW w:type="pct" w:w="6%"/>
           </w:tcPr>
           <w:p>
             <w:pPr>
@@ -5657,7 +5657,7 @@
       <w:tr>
         <w:tc>
           <w:tcPr>
-            <w:tcW w:type="pct" w:w="16%"/>
+            <w:tcW w:type="pct" w:w="14%"/>
           </w:tcPr>
           <w:p>
             <w:pPr>
@@ -5675,7 +5675,7 @@
         </w:tc>
         <w:tc>
           <w:tcPr>
-            <w:tcW w:type="pct" w:w="14%"/>
+            <w:tcW w:type="pct" w:w="12%"/>
           </w:tcPr>
           <w:p>
             <w:pPr>
@@ -5693,6 +5693,60 @@
         </w:tc>
         <w:tc>
           <w:tcPr>
+            <w:tcW w:type="pct" w:w="12%"/>
+          </w:tcPr>
+          <w:p>
+            <w:pPr>
+              <w:jc w:val="left"/>
+            </w:pPr>
+            <w:r>
+              <w:rPr>
+                <w:rFonts w:ascii="Times New Roman" w:cs="Times New Roman" w:eastAsia="Times New Roman" w:hAnsi="Times New Roman"/>
+                <w:sz w:val="22"/>
+                <w:szCs w:val="22"/>
+              </w:rPr>
+              <w:t xml:space="preserve">{item_5_date}</w:t>
+            </w:r>
+          </w:p>
+        </w:tc>
+        <w:tc>
+          <w:tcPr>
+            <w:tcW w:type="pct" w:w="6%"/>
+          </w:tcPr>
+          <w:p>
+            <w:pPr>
+              <w:jc w:val="left"/>
+            </w:pPr>
+            <w:r>
+              <w:rPr>
+                <w:rFonts w:ascii="Times New Roman" w:cs="Times New Roman" w:eastAsia="Times New Roman" w:hAnsi="Times New Roman"/>
+                <w:sz w:val="22"/>
+                <w:szCs w:val="22"/>
+              </w:rPr>
+              <w:t xml:space="preserve">{item_5_qty}</w:t>
+            </w:r>
+          </w:p>
+        </w:tc>
+        <w:tc>
+          <w:tcPr>
+            <w:tcW w:type="pct" w:w="8%"/>
+          </w:tcPr>
+          <w:p>
+            <w:pPr>
+              <w:jc w:val="left"/>
+            </w:pPr>
+            <w:r>
+              <w:rPr>
+                <w:rFonts w:ascii="Times New Roman" w:cs="Times New Roman" w:eastAsia="Times New Roman" w:hAnsi="Times New Roman"/>
+                <w:sz w:val="22"/>
+                <w:szCs w:val="22"/>
+              </w:rPr>
+              <w:t xml:space="preserve">лично</w:t>
+            </w:r>
+          </w:p>
+        </w:tc>
+        <w:tc>
+          <w:tcPr>
             <w:tcW w:type="pct" w:w="10%"/>
           </w:tcPr>
           <w:p>
@@ -5705,43 +5759,7 @@
                 <w:sz w:val="22"/>
                 <w:szCs w:val="22"/>
               </w:rPr>
-              <w:t xml:space="preserve">{item_5_date}</w:t>
-            </w:r>
-          </w:p>
-        </w:tc>
-        <w:tc>
-          <w:tcPr>
-            <w:tcW w:type="pct" w:w="8%"/>
-          </w:tcPr>
-          <w:p>
-            <w:pPr>
-              <w:jc w:val="left"/>
-            </w:pPr>
-            <w:r>
-              <w:rPr>
-                <w:rFonts w:ascii="Times New Roman" w:cs="Times New Roman" w:eastAsia="Times New Roman" w:hAnsi="Times New Roman"/>
-                <w:sz w:val="22"/>
-                <w:szCs w:val="22"/>
-              </w:rPr>
-              <w:t xml:space="preserve">{item_5_qty}</w:t>
-            </w:r>
-          </w:p>
-        </w:tc>
-        <w:tc>
-          <w:tcPr>
-            <w:tcW w:type="pct" w:w="8%"/>
-          </w:tcPr>
-          <w:p>
-            <w:pPr>
-              <w:jc w:val="left"/>
-            </w:pPr>
-            <w:r>
-              <w:rPr>
-                <w:rFonts w:ascii="Times New Roman" w:cs="Times New Roman" w:eastAsia="Times New Roman" w:hAnsi="Times New Roman"/>
-                <w:sz w:val="22"/>
-                <w:szCs w:val="22"/>
-              </w:rPr>
-              <w:t xml:space="preserve">лично</w:t>
+              <w:t xml:space="preserve">{item_5_sign}</w:t>
             </w:r>
           </w:p>
         </w:tc>
@@ -5759,31 +5777,13 @@
                 <w:sz w:val="22"/>
                 <w:szCs w:val="22"/>
               </w:rPr>
-              <w:t xml:space="preserve">{item_5_sign}</w:t>
-            </w:r>
-          </w:p>
-        </w:tc>
-        <w:tc>
-          <w:tcPr>
-            <w:tcW w:type="pct" w:w="10%"/>
-          </w:tcPr>
-          <w:p>
-            <w:pPr>
-              <w:jc w:val="left"/>
-            </w:pPr>
-            <w:r>
-              <w:rPr>
-                <w:rFonts w:ascii="Times New Roman" w:cs="Times New Roman" w:eastAsia="Times New Roman" w:hAnsi="Times New Roman"/>
-                <w:sz w:val="22"/>
-                <w:szCs w:val="22"/>
-              </w:rPr>
               <w:t xml:space="preserve">‒</w:t>
             </w:r>
           </w:p>
         </w:tc>
         <w:tc>
           <w:tcPr>
-            <w:tcW w:type="pct" w:w="10%"/>
+            <w:tcW w:type="pct" w:w="8%"/>
           </w:tcPr>
           <w:p>
             <w:pPr>
@@ -5819,7 +5819,7 @@
         </w:tc>
         <w:tc>
           <w:tcPr>
-            <w:tcW w:type="pct" w:w="8%"/>
+            <w:tcW w:type="pct" w:w="6%"/>
           </w:tcPr>
           <w:p>
             <w:pPr>

</xml_diff>